<commit_message>
add Github repo link
</commit_message>
<xml_diff>
--- a/Capstone_Proposal.docx
+++ b/Capstone_Proposal.docx
@@ -1,6 +1,6 @@
 
 <file path=word/document.xml><?xml version="1.0" encoding="utf-8"?>
-<w:document xmlns:wpc="http://schemas.microsoft.com/office/word/2010/wordprocessingCanvas" xmlns:mc="http://schemas.openxmlformats.org/markup-compatibility/2006" xmlns:o="urn:schemas-microsoft-com:office:office" xmlns:r="http://schemas.openxmlformats.org/officeDocument/2006/relationships" xmlns:m="http://schemas.openxmlformats.org/officeDocument/2006/math" xmlns:v="urn:schemas-microsoft-com:vml" xmlns:wp14="http://schemas.microsoft.com/office/word/2010/wordprocessingDrawing" xmlns:wp="http://schemas.openxmlformats.org/drawingml/2006/wordprocessingDrawing" xmlns:w10="urn:schemas-microsoft-com:office:word" xmlns:w="http://schemas.openxmlformats.org/wordprocessingml/2006/main" xmlns:w14="http://schemas.microsoft.com/office/word/2010/wordml" xmlns:w15="http://schemas.microsoft.com/office/word/2012/wordml" xmlns:wpg="http://schemas.microsoft.com/office/word/2010/wordprocessingGroup" xmlns:wpi="http://schemas.microsoft.com/office/word/2010/wordprocessingInk" xmlns:wne="http://schemas.microsoft.com/office/word/2006/wordml" xmlns:wps="http://schemas.microsoft.com/office/word/2010/wordprocessingShape" xmlns:cx="http://schemas.microsoft.com/office/drawing/2014/chartex" xmlns:cx1="http://schemas.microsoft.com/office/drawing/2015/9/8/chartex" xmlns:cx2="http://schemas.microsoft.com/office/drawing/2015/10/21/chartex" xmlns:cx3="http://schemas.microsoft.com/office/drawing/2016/5/9/chartex" xmlns:cx4="http://schemas.microsoft.com/office/drawing/2016/5/10/chartex" xmlns:cx5="http://schemas.microsoft.com/office/drawing/2016/5/11/chartex" xmlns:cx6="http://schemas.microsoft.com/office/drawing/2016/5/12/chartex" xmlns:cx7="http://schemas.microsoft.com/office/drawing/2016/5/13/chartex" xmlns:cx8="http://schemas.microsoft.com/office/drawing/2016/5/14/chartex" xmlns:aink="http://schemas.microsoft.com/office/drawing/2016/ink" xmlns:am3d="http://schemas.microsoft.com/office/drawing/2017/model3d" xmlns:w16cex="http://schemas.microsoft.com/office/word/2018/wordml/cex" xmlns:w16cid="http://schemas.microsoft.com/office/word/2016/wordml/cid" xmlns:w16="http://schemas.microsoft.com/office/word/2018/wordml" xmlns:w16sdtdh="http://schemas.microsoft.com/office/word/2020/wordml/sdtdatahash" xmlns:w16se="http://schemas.microsoft.com/office/word/2015/wordml/symex" mc:Ignorable="w14 w15 wp14">
+<w:document xmlns:wpc="http://schemas.microsoft.com/office/word/2010/wordprocessingCanvas" xmlns:cx="http://schemas.microsoft.com/office/drawing/2014/chartex" xmlns:cx1="http://schemas.microsoft.com/office/drawing/2015/9/8/chartex" xmlns:cx2="http://schemas.microsoft.com/office/drawing/2015/10/21/chartex" xmlns:cx3="http://schemas.microsoft.com/office/drawing/2016/5/9/chartex" xmlns:cx4="http://schemas.microsoft.com/office/drawing/2016/5/10/chartex" xmlns:cx5="http://schemas.microsoft.com/office/drawing/2016/5/11/chartex" xmlns:cx6="http://schemas.microsoft.com/office/drawing/2016/5/12/chartex" xmlns:cx7="http://schemas.microsoft.com/office/drawing/2016/5/13/chartex" xmlns:cx8="http://schemas.microsoft.com/office/drawing/2016/5/14/chartex" xmlns:mc="http://schemas.openxmlformats.org/markup-compatibility/2006" xmlns:aink="http://schemas.microsoft.com/office/drawing/2016/ink" xmlns:am3d="http://schemas.microsoft.com/office/drawing/2017/model3d" xmlns:o="urn:schemas-microsoft-com:office:office" xmlns:oel="http://schemas.microsoft.com/office/2019/extlst" xmlns:r="http://schemas.openxmlformats.org/officeDocument/2006/relationships" xmlns:m="http://schemas.openxmlformats.org/officeDocument/2006/math" xmlns:v="urn:schemas-microsoft-com:vml" xmlns:wp14="http://schemas.microsoft.com/office/word/2010/wordprocessingDrawing" xmlns:wp="http://schemas.openxmlformats.org/drawingml/2006/wordprocessingDrawing" xmlns:w10="urn:schemas-microsoft-com:office:word" xmlns:w="http://schemas.openxmlformats.org/wordprocessingml/2006/main" xmlns:w14="http://schemas.microsoft.com/office/word/2010/wordml" xmlns:w15="http://schemas.microsoft.com/office/word/2012/wordml" xmlns:w16cex="http://schemas.microsoft.com/office/word/2018/wordml/cex" xmlns:w16cid="http://schemas.microsoft.com/office/word/2016/wordml/cid" xmlns:w16="http://schemas.microsoft.com/office/word/2018/wordml" xmlns:w16du="http://schemas.microsoft.com/office/word/2023/wordml/word16du" xmlns:w16sdtdh="http://schemas.microsoft.com/office/word/2020/wordml/sdtdatahash" xmlns:w16sdtfl="http://schemas.microsoft.com/office/word/2024/wordml/sdtformatlock" xmlns:w16se="http://schemas.microsoft.com/office/word/2015/wordml/symex" xmlns:wpg="http://schemas.microsoft.com/office/word/2010/wordprocessingGroup" xmlns:wpi="http://schemas.microsoft.com/office/word/2010/wordprocessingInk" xmlns:wne="http://schemas.microsoft.com/office/word/2006/wordml" xmlns:wps="http://schemas.microsoft.com/office/word/2010/wordprocessingShape" mc:Ignorable="w14 w15 w16se w16cid w16 w16cex w16sdtdh w16sdtfl w16du wp14">
   <w:background w:color="FFFFFF"/>
   <w:body>
     <w:p>
@@ -12,11 +12,10 @@
         <w:rPr>
           <w:b/>
           <w:bCs/>
-          <w:color w:val="000000"/>
           <w:sz w:val="34"/>
           <w:szCs w:val="34"/>
         </w:rPr>
-        <w:t xml:space="preserve">Capstone Project Proposal</w:t>
+        <w:t>Capstone Project Proposal</w:t>
       </w:r>
     </w:p>
     <w:p>
@@ -26,34 +25,44 @@
       </w:pPr>
       <w:r>
         <w:rPr>
-          <w:color w:val="000000"/>
           <w:sz w:val="24"/>
           <w:szCs w:val="24"/>
         </w:rPr>
-        <w:t xml:space="preserve">Natural-Language Playlist-Builder Agent</w:t>
+        <w:t>Natural-Language Playlist-Builder Agent</w:t>
       </w:r>
     </w:p>
     <w:tbl>
       <w:tblPr>
-        <w:tblW w:type="dxa" w:w="9360"/>
+        <w:tblW w:w="9360" w:type="dxa"/>
         <w:tblBorders>
-          <w:top w:val="single" w:color="auto" w:sz="4"/>
-          <w:left w:val="single" w:color="auto" w:sz="4"/>
-          <w:bottom w:val="single" w:color="auto" w:sz="4"/>
-          <w:right w:val="single" w:color="auto" w:sz="4"/>
-          <w:insideH w:val="single" w:color="auto" w:sz="4"/>
-          <w:insideV w:val="single" w:color="auto" w:sz="4"/>
+          <w:top w:val="single" w:sz="4" w:space="0" w:color="auto"/>
+          <w:left w:val="single" w:sz="4" w:space="0" w:color="auto"/>
+          <w:bottom w:val="single" w:sz="4" w:space="0" w:color="auto"/>
+          <w:right w:val="single" w:sz="4" w:space="0" w:color="auto"/>
+          <w:insideH w:val="single" w:sz="4" w:space="0" w:color="auto"/>
+          <w:insideV w:val="single" w:sz="4" w:space="0" w:color="auto"/>
         </w:tblBorders>
+        <w:tblCellMar>
+          <w:left w:w="10" w:type="dxa"/>
+          <w:right w:w="10" w:type="dxa"/>
+        </w:tblCellMar>
+        <w:tblLook w:val="04A0" w:firstRow="1" w:lastRow="0" w:firstColumn="1" w:lastColumn="0" w:noHBand="0" w:noVBand="1"/>
       </w:tblPr>
       <w:tblGrid>
         <w:gridCol w:w="2600"/>
         <w:gridCol w:w="6760"/>
       </w:tblGrid>
       <w:tr>
+        <w:tblPrEx>
+          <w:tblCellMar>
+            <w:top w:w="0" w:type="dxa"/>
+            <w:bottom w:w="0" w:type="dxa"/>
+          </w:tblCellMar>
+        </w:tblPrEx>
         <w:tc>
           <w:tcPr>
-            <w:tcW w:type="dxa" w:w="2600"/>
-            <w:shd w:fill="FFFFFF" w:val="clear"/>
+            <w:tcW w:w="2600" w:type="dxa"/>
+            <w:shd w:val="clear" w:color="auto" w:fill="FFFFFF"/>
           </w:tcPr>
           <w:p>
             <w:pPr>
@@ -64,29 +73,55 @@
                 <w:b/>
                 <w:bCs/>
               </w:rPr>
-              <w:t xml:space="preserve">Student name</w:t>
+              <w:t>Student name</w:t>
             </w:r>
           </w:p>
         </w:tc>
         <w:tc>
           <w:tcPr>
-            <w:tcW w:type="dxa" w:w="6760"/>
+            <w:tcW w:w="6760" w:type="dxa"/>
           </w:tcPr>
           <w:p>
             <w:pPr>
               <w:spacing w:after="100"/>
             </w:pPr>
             <w:r>
-              <w:t xml:space="preserve">Ephraim  (ephraimtjofficial@gmail.com)</w:t>
+              <w:t>Ephraim T</w:t>
+            </w:r>
+            <w:r>
+              <w:t xml:space="preserve">homas </w:t>
+            </w:r>
+            <w:proofErr w:type="gramStart"/>
+            <w:r>
+              <w:t>J</w:t>
+            </w:r>
+            <w:r>
+              <w:t>acob</w:t>
+            </w:r>
+            <w:r>
+              <w:t xml:space="preserve">  (</w:t>
+            </w:r>
+            <w:proofErr w:type="gramEnd"/>
+            <w:r>
+              <w:t>ejacob32@asu.edu</w:t>
+            </w:r>
+            <w:r>
+              <w:t>)</w:t>
             </w:r>
           </w:p>
         </w:tc>
       </w:tr>
       <w:tr>
+        <w:tblPrEx>
+          <w:tblCellMar>
+            <w:top w:w="0" w:type="dxa"/>
+            <w:bottom w:w="0" w:type="dxa"/>
+          </w:tblCellMar>
+        </w:tblPrEx>
         <w:tc>
           <w:tcPr>
-            <w:tcW w:type="dxa" w:w="2600"/>
-            <w:shd w:fill="FFFFFF" w:val="clear"/>
+            <w:tcW w:w="2600" w:type="dxa"/>
+            <w:shd w:val="clear" w:color="auto" w:fill="FFFFFF"/>
           </w:tcPr>
           <w:p>
             <w:pPr>
@@ -97,29 +132,35 @@
                 <w:b/>
                 <w:bCs/>
               </w:rPr>
-              <w:t xml:space="preserve">Project title</w:t>
+              <w:t>Project title</w:t>
             </w:r>
           </w:p>
         </w:tc>
         <w:tc>
           <w:tcPr>
-            <w:tcW w:type="dxa" w:w="6760"/>
+            <w:tcW w:w="6760" w:type="dxa"/>
           </w:tcPr>
           <w:p>
             <w:pPr>
               <w:spacing w:after="100"/>
             </w:pPr>
             <w:r>
-              <w:t xml:space="preserve">Natural-Language Playlist-Builder Agent</w:t>
+              <w:t>Natural-Language Playlist-Builder Agent</w:t>
             </w:r>
           </w:p>
         </w:tc>
       </w:tr>
       <w:tr>
+        <w:tblPrEx>
+          <w:tblCellMar>
+            <w:top w:w="0" w:type="dxa"/>
+            <w:bottom w:w="0" w:type="dxa"/>
+          </w:tblCellMar>
+        </w:tblPrEx>
         <w:tc>
           <w:tcPr>
-            <w:tcW w:type="dxa" w:w="2600"/>
-            <w:shd w:fill="FFFFFF" w:val="clear"/>
+            <w:tcW w:w="2600" w:type="dxa"/>
+            <w:shd w:val="clear" w:color="auto" w:fill="FFFFFF"/>
           </w:tcPr>
           <w:p>
             <w:pPr>
@@ -130,34 +171,35 @@
                 <w:b/>
                 <w:bCs/>
               </w:rPr>
-              <w:t xml:space="preserve">Repository / notebook link</w:t>
+              <w:t>Repository / notebook link</w:t>
             </w:r>
           </w:p>
         </w:tc>
         <w:tc>
           <w:tcPr>
-            <w:tcW w:type="dxa" w:w="6760"/>
+            <w:tcW w:w="6760" w:type="dxa"/>
           </w:tcPr>
           <w:p>
             <w:pPr>
               <w:spacing w:after="100"/>
             </w:pPr>
             <w:r>
-              <w:rPr>
-                <w:rFonts w:ascii="Consolas" w:cs="Consolas" w:eastAsia="Consolas" w:hAnsi="Consolas"/>
-                <w:sz w:val="19"/>
-                <w:szCs w:val="19"/>
-              </w:rPr>
-              <w:t xml:space="preserve">Local repo: C:\AdrenoX\Work\University\Semester 3\Agentic AI\Capstone  (entry point: run_baseline.py). Not yet pushed to GitHub.</w:t>
+              <w:t>https://github.com/EphraimTJ/capstone-playlist-agent</w:t>
             </w:r>
           </w:p>
         </w:tc>
       </w:tr>
       <w:tr>
+        <w:tblPrEx>
+          <w:tblCellMar>
+            <w:top w:w="0" w:type="dxa"/>
+            <w:bottom w:w="0" w:type="dxa"/>
+          </w:tblCellMar>
+        </w:tblPrEx>
         <w:tc>
           <w:tcPr>
-            <w:tcW w:type="dxa" w:w="2600"/>
-            <w:shd w:fill="FFFFFF" w:val="clear"/>
+            <w:tcW w:w="2600" w:type="dxa"/>
+            <w:shd w:val="clear" w:color="auto" w:fill="FFFFFF"/>
           </w:tcPr>
           <w:p>
             <w:pPr>
@@ -168,20 +210,20 @@
                 <w:b/>
                 <w:bCs/>
               </w:rPr>
-              <w:t xml:space="preserve">Configuration location</w:t>
+              <w:t>Configuration location</w:t>
             </w:r>
           </w:p>
         </w:tc>
         <w:tc>
           <w:tcPr>
-            <w:tcW w:type="dxa" w:w="6760"/>
+            <w:tcW w:w="6760" w:type="dxa"/>
           </w:tcPr>
           <w:p>
             <w:pPr>
               <w:spacing w:after="100"/>
             </w:pPr>
             <w:r>
-              <w:t xml:space="preserve">examples/readme.md</w:t>
+              <w:t>examples/readme.md</w:t>
             </w:r>
           </w:p>
         </w:tc>
@@ -190,7 +232,7 @@
     <w:p>
       <w:pPr>
         <w:pStyle w:val="Heading2"/>
-        <w:spacing w:after="90" w:before="220"/>
+        <w:spacing w:before="220" w:after="90"/>
       </w:pPr>
       <w:r>
         <w:rPr>
@@ -198,7 +240,7 @@
           <w:bCs/>
           <w:color w:val="000000"/>
         </w:rPr>
-        <w:t xml:space="preserve">1. Problem Definition</w:t>
+        <w:t>1. Problem Definition</w:t>
       </w:r>
     </w:p>
     <w:p>
@@ -213,7 +255,13 @@
         <w:t xml:space="preserve">Task. </w:t>
       </w:r>
       <w:r>
-        <w:t xml:space="preserve">Given a plain-English description of a desired playlist (a mood, activity, era, or genre), the agent selects real tracks from a Spotify dataset by filtering on audio features and returns a playlist that matches the request — it never invents songs.</w:t>
+        <w:t>Given a plain</w:t>
+      </w:r>
+      <w:r>
+        <w:t xml:space="preserve"> </w:t>
+      </w:r>
+      <w:r>
+        <w:t>English description of a desired playlist (a mood, activity, era, or genre), the agent selects real tracks from a Spotify dataset by filtering on audio features and returns a playlist that matches the request.</w:t>
       </w:r>
     </w:p>
     <w:p>
@@ -228,7 +276,19 @@
         <w:t xml:space="preserve">Intended user &amp; situation. </w:t>
       </w:r>
       <w:r>
-        <w:t xml:space="preserve">A listener who wants a playlist for a specific vibe or activity (“high-energy pop for a workout”) but does not want to hand-pick tracks or translate their taste into audio-feature filters.</w:t>
+        <w:t>A listener who wants a playlist for a specific vibe or activity (“high</w:t>
+      </w:r>
+      <w:r>
+        <w:t xml:space="preserve"> </w:t>
+      </w:r>
+      <w:r>
+        <w:t>energy pop for a workout”) but does not want to hand</w:t>
+      </w:r>
+      <w:r>
+        <w:t xml:space="preserve"> </w:t>
+      </w:r>
+      <w:r>
+        <w:t>pick tracks or translate their taste into audio-feature filters.</w:t>
       </w:r>
     </w:p>
     <w:p>
@@ -243,7 +303,13 @@
         <w:t xml:space="preserve">Input. </w:t>
       </w:r>
       <w:r>
-        <w:t xml:space="preserve">(1) a natural-language playlist request (a text file), and (2) the Spotify tracks dataset (CSV, ~33k tracks).</w:t>
+        <w:t>(1) a natural</w:t>
+      </w:r>
+      <w:r>
+        <w:t xml:space="preserve"> </w:t>
+      </w:r>
+      <w:r>
+        <w:t>language playlist request (a text file), and (2) the Spotify tracks dataset (CSV, ~33k tracks).</w:t>
       </w:r>
     </w:p>
     <w:p>
@@ -258,7 +324,7 @@
         <w:t xml:space="preserve">Output. </w:t>
       </w:r>
       <w:r>
-        <w:t xml:space="preserve">A playlist: a one-line summary of the filters applied, followed by a numbered list of tracks with title, artist, genre, release year, and key audio features.</w:t>
+        <w:t>A playlist: a one-line summary of the filters applied, followed by a numbered list of tracks with title, artist, genre, release year, and key audio features.</w:t>
       </w:r>
     </w:p>
     <w:p>
@@ -273,7 +339,7 @@
         <w:t xml:space="preserve">Success. </w:t>
       </w:r>
       <w:r>
-        <w:t xml:space="preserve">Every returned track satisfies the constraints stated or implied by the request (genre, era, energy/mood, …), the number of tracks matches the request, there are no duplicates, and every track exists in the dataset.</w:t>
+        <w:t>Every returned track satisfies the constraints stated or implied by the request (genre, era, energy/mood, …), the number of tracks matches the request, there are no duplicates, and every track exists in the dataset.</w:t>
       </w:r>
     </w:p>
     <w:p>
@@ -288,13 +354,13 @@
         <w:t xml:space="preserve">Failure. </w:t>
       </w:r>
       <w:r>
-        <w:t xml:space="preserve">A track violates a stated constraint, the wrong number of songs is returned, duplicates appear, or a track is hallucinated (not in the dataset).</w:t>
+        <w:t>A track violates a stated constraint, the wrong number of songs is returned, duplicates appear, or a track is hallucinated (not in the dataset).</w:t>
       </w:r>
     </w:p>
     <w:p>
       <w:pPr>
         <w:pStyle w:val="Heading2"/>
-        <w:spacing w:after="90" w:before="220"/>
+        <w:spacing w:before="220" w:after="90"/>
       </w:pPr>
       <w:r>
         <w:rPr>
@@ -302,7 +368,7 @@
           <w:bCs/>
           <w:color w:val="000000"/>
         </w:rPr>
-        <w:t xml:space="preserve">2. Motivation and Project Scope</w:t>
+        <w:t>2. Motivation and Project Scope</w:t>
       </w:r>
     </w:p>
     <w:p>
@@ -317,7 +383,7 @@
         <w:t xml:space="preserve">Why it matters. </w:t>
       </w:r>
       <w:r>
-        <w:t xml:space="preserve">Playlist curation is a core music-listening task. Describing what you want in words is natural, but mapping that description onto concrete audio-feature filters (tempo, energy, valence…) is not something end-users do — an agent can bridge that gap.</w:t>
+        <w:t>Playlist curation is a core music-listening task. Describing what you want in words is natural, but mapping that description onto concrete audio-feature filters (tempo, energy, valence…) is not something end-users do — an agent can bridge that gap.</w:t>
       </w:r>
     </w:p>
     <w:p>
@@ -332,7 +398,7 @@
         <w:t xml:space="preserve">Why an agentic approach. </w:t>
       </w:r>
       <w:r>
-        <w:t xml:space="preserve">The task requires interpreting fuzzy language, exploring the catalog, and composing and executing filters iteratively — tool use over a dataset rather than a single model call. Grounding every pick in the real catalog is what prevents hallucinated songs.</w:t>
+        <w:t>The task requires interpreting fuzzy language, exploring the catalog, and composing and executing filters iteratively rather than a single model call. Grounding every pick in the real catalog is what prevents hallucinated songs.</w:t>
       </w:r>
     </w:p>
     <w:p>
@@ -357,7 +423,7 @@
         <w:spacing w:after="60"/>
       </w:pPr>
       <w:r>
-        <w:t xml:space="preserve">A single ~33k-track dataset; constraints on genre, release era, and audio features (energy, danceability, valence/mood, acousticness, tempo, popularity).</w:t>
+        <w:t>A single ~33k-track dataset; constraints on genre, release era, and audio features (energy, danceability, valence/mood, acousticness, tempo, popularity).</w:t>
       </w:r>
     </w:p>
     <w:p>
@@ -370,7 +436,19 @@
         <w:spacing w:after="60"/>
       </w:pPr>
       <w:r>
-        <w:t xml:space="preserve">A tool-use loop that filters the catalog, de-duplicates, and honours a requested track count.</w:t>
+        <w:t>A tool</w:t>
+      </w:r>
+      <w:r>
+        <w:t xml:space="preserve"> </w:t>
+      </w:r>
+      <w:r>
+        <w:t xml:space="preserve">use loop that filters the catalog, de-duplicates, and </w:t>
+      </w:r>
+      <w:r>
+        <w:t>honors</w:t>
+      </w:r>
+      <w:r>
+        <w:t xml:space="preserve"> a requested track count.</w:t>
       </w:r>
     </w:p>
     <w:p>
@@ -383,7 +461,7 @@
         <w:spacing w:after="60"/>
       </w:pPr>
       <w:r>
-        <w:t xml:space="preserve">At least two concrete test requests and a constraint-satisfaction check.</w:t>
+        <w:t>At least two concrete test requests and a constraint-satisfaction check.</w:t>
       </w:r>
     </w:p>
     <w:p>
@@ -408,7 +486,7 @@
         <w:spacing w:after="60"/>
       </w:pPr>
       <w:r>
-        <w:t xml:space="preserve">Creating/playing playlists via the real Spotify API (a planned later extension), and raw audio-signal analysis.</w:t>
+        <w:t>Creating/playing playlists via the real Spotify API (a planned later extension), and raw audio-signal analysis.</w:t>
       </w:r>
     </w:p>
     <w:p>
@@ -421,13 +499,13 @@
         <w:spacing w:after="60"/>
       </w:pPr>
       <w:r>
-        <w:t xml:space="preserve">Personalization from listening history, multi-dataset catalogs, and requests needing knowledge outside the provided features (e.g. lyrical themes).</w:t>
+        <w:t>Personalization from listening history, multi-dataset catalogs, and requests needing knowledge outside the provided features (e.g. lyrical themes).</w:t>
       </w:r>
     </w:p>
     <w:p>
       <w:pPr>
         <w:pStyle w:val="Heading2"/>
-        <w:spacing w:after="90" w:before="220"/>
+        <w:spacing w:before="220" w:after="90"/>
       </w:pPr>
       <w:r>
         <w:rPr>
@@ -435,7 +513,7 @@
           <w:bCs/>
           <w:color w:val="000000"/>
         </w:rPr>
-        <w:t xml:space="preserve">3. Runnable Baseline</w:t>
+        <w:t>3. Runnable Baseline</w:t>
       </w:r>
     </w:p>
     <w:p>
@@ -450,7 +528,7 @@
         <w:t xml:space="preserve">Type. </w:t>
       </w:r>
       <w:r>
-        <w:t xml:space="preserve">A tool-use / agentic-loop baseline.</w:t>
+        <w:t>A tool-use / agentic-loop baseline.</w:t>
       </w:r>
     </w:p>
     <w:p>
@@ -469,44 +547,44 @@
       </w:r>
       <w:r>
         <w:rPr>
-          <w:rFonts w:ascii="Consolas" w:cs="Consolas" w:eastAsia="Consolas" w:hAnsi="Consolas"/>
+          <w:rFonts w:ascii="Consolas" w:eastAsia="Consolas" w:hAnsi="Consolas" w:cs="Consolas"/>
           <w:sz w:val="19"/>
           <w:szCs w:val="19"/>
         </w:rPr>
-        <w:t xml:space="preserve">pandas</w:t>
+        <w:t>pandas</w:t>
       </w:r>
       <w:r>
         <w:t xml:space="preserve">, and the </w:t>
       </w:r>
       <w:r>
         <w:rPr>
-          <w:rFonts w:ascii="Consolas" w:cs="Consolas" w:eastAsia="Consolas" w:hAnsi="Consolas"/>
+          <w:rFonts w:ascii="Consolas" w:eastAsia="Consolas" w:hAnsi="Consolas" w:cs="Consolas"/>
           <w:sz w:val="19"/>
           <w:szCs w:val="19"/>
         </w:rPr>
-        <w:t xml:space="preserve">openai</w:t>
+        <w:t>openai</w:t>
       </w:r>
       <w:r>
         <w:t xml:space="preserve"> SDK pointed at an OpenAI-compatible endpoint. The reference run uses Groq’s free tier with model </w:t>
       </w:r>
       <w:r>
         <w:rPr>
-          <w:rFonts w:ascii="Consolas" w:cs="Consolas" w:eastAsia="Consolas" w:hAnsi="Consolas"/>
+          <w:rFonts w:ascii="Consolas" w:eastAsia="Consolas" w:hAnsi="Consolas" w:cs="Consolas"/>
           <w:sz w:val="19"/>
           <w:szCs w:val="19"/>
         </w:rPr>
-        <w:t xml:space="preserve">openai/gpt-oss-120b</w:t>
+        <w:t>openai/gpt-oss-120b</w:t>
       </w:r>
       <w:r>
         <w:t xml:space="preserve">. Dataset: the TidyTuesday </w:t>
       </w:r>
       <w:r>
         <w:rPr>
-          <w:rFonts w:ascii="Consolas" w:cs="Consolas" w:eastAsia="Consolas" w:hAnsi="Consolas"/>
+          <w:rFonts w:ascii="Consolas" w:eastAsia="Consolas" w:hAnsi="Consolas" w:cs="Consolas"/>
           <w:sz w:val="19"/>
           <w:szCs w:val="19"/>
         </w:rPr>
-        <w:t xml:space="preserve">spotify_songs.csv</w:t>
+        <w:t>spotify_songs.csv</w:t>
       </w:r>
       <w:r>
         <w:t xml:space="preserve"> (~33k tracks), hosted on GitHub and auto-downloaded on first run.</w:t>
@@ -534,18 +612,19 @@
         <w:spacing w:after="60"/>
       </w:pPr>
       <w:r>
+        <w:lastRenderedPageBreak/>
         <w:t xml:space="preserve">Ensures the dataset is present (downloads it from GitHub if missing) and loads it into a DataFrame </w:t>
       </w:r>
       <w:r>
         <w:rPr>
-          <w:rFonts w:ascii="Consolas" w:cs="Consolas" w:eastAsia="Consolas" w:hAnsi="Consolas"/>
+          <w:rFonts w:ascii="Consolas" w:eastAsia="Consolas" w:hAnsi="Consolas" w:cs="Consolas"/>
           <w:sz w:val="19"/>
           <w:szCs w:val="19"/>
         </w:rPr>
-        <w:t xml:space="preserve">df</w:t>
-      </w:r>
-      <w:r>
-        <w:t xml:space="preserve">.</w:t>
+        <w:t>df</w:t>
+      </w:r>
+      <w:r>
+        <w:t>.</w:t>
       </w:r>
     </w:p>
     <w:p>
@@ -558,7 +637,7 @@
         <w:spacing w:after="60"/>
       </w:pPr>
       <w:r>
-        <w:t xml:space="preserve">Builds a system prompt describing the schema, the meaning of each audio feature, and a de-duplication rule.</w:t>
+        <w:t>Builds a system prompt describing the schema, the meaning of each audio feature, and a de-duplication rule.</w:t>
       </w:r>
     </w:p>
     <w:p>
@@ -575,14 +654,14 @@
       </w:r>
       <w:r>
         <w:rPr>
-          <w:rFonts w:ascii="Consolas" w:cs="Consolas" w:eastAsia="Consolas" w:hAnsi="Consolas"/>
+          <w:rFonts w:ascii="Consolas" w:eastAsia="Consolas" w:hAnsi="Consolas" w:cs="Consolas"/>
           <w:sz w:val="19"/>
           <w:szCs w:val="19"/>
         </w:rPr>
-        <w:t xml:space="preserve">run_pandas(code)</w:t>
-      </w:r>
-      <w:r>
-        <w:t xml:space="preserve">.</w:t>
+        <w:t>run_pandas(code)</w:t>
+      </w:r>
+      <w:r>
+        <w:t>.</w:t>
       </w:r>
     </w:p>
     <w:p>
@@ -599,11 +678,11 @@
       </w:r>
       <w:r>
         <w:rPr>
-          <w:rFonts w:ascii="Consolas" w:cs="Consolas" w:eastAsia="Consolas" w:hAnsi="Consolas"/>
+          <w:rFonts w:ascii="Consolas" w:eastAsia="Consolas" w:hAnsi="Consolas" w:cs="Consolas"/>
           <w:sz w:val="19"/>
           <w:szCs w:val="19"/>
         </w:rPr>
-        <w:t xml:space="preserve">df</w:t>
+        <w:t>df</w:t>
       </w:r>
       <w:r>
         <w:t xml:space="preserve"> and its printed output is returned to the model.</w:t>
@@ -619,7 +698,7 @@
         <w:spacing w:after="60"/>
       </w:pPr>
       <w:r>
-        <w:t xml:space="preserve">The loop repeats (bounded to 12 steps) until the model returns a filter summary and a numbered playlist, which is printed and saved to outputs/.</w:t>
+        <w:t>The loop repeats (bounded to 12 steps) until the model returns a filter summary and a numbered playlist, which is printed and saved to outputs/.</w:t>
       </w:r>
     </w:p>
     <w:p>
@@ -634,7 +713,7 @@
         <w:t xml:space="preserve">Why this is a reasonable start. </w:t>
       </w:r>
       <w:r>
-        <w:t xml:space="preserve">It is minimal yet genuinely agentic (real iterative tool use), grounds every selection in the real catalog, produces a measurable output (constraint satisfaction), and extends naturally to the live Spotify API.</w:t>
+        <w:t>It is minimal yet genuinely agentic (real iterative tool use), grounds every selection in the real catalog, produces a measurable output (constraint satisfaction), and extends naturally to the live Spotify API.</w:t>
       </w:r>
     </w:p>
     <w:p>
@@ -650,86 +729,86 @@
       </w:r>
       <w:r>
         <w:rPr>
-          <w:rFonts w:ascii="Consolas" w:cs="Consolas" w:eastAsia="Consolas" w:hAnsi="Consolas"/>
+          <w:rFonts w:ascii="Consolas" w:eastAsia="Consolas" w:hAnsi="Consolas" w:cs="Consolas"/>
           <w:sz w:val="19"/>
           <w:szCs w:val="19"/>
         </w:rPr>
-        <w:t xml:space="preserve">run_baseline.py</w:t>
+        <w:t>run_baseline.py</w:t>
       </w:r>
       <w:r>
         <w:t xml:space="preserve"> (agent, loop, tool), </w:t>
       </w:r>
       <w:r>
         <w:rPr>
-          <w:rFonts w:ascii="Consolas" w:cs="Consolas" w:eastAsia="Consolas" w:hAnsi="Consolas"/>
+          <w:rFonts w:ascii="Consolas" w:eastAsia="Consolas" w:hAnsi="Consolas" w:cs="Consolas"/>
           <w:sz w:val="19"/>
           <w:szCs w:val="19"/>
         </w:rPr>
-        <w:t xml:space="preserve">examples/spotify_songs.csv</w:t>
+        <w:t>examples/spotify_songs.csv</w:t>
       </w:r>
       <w:r>
         <w:t xml:space="preserve"> (data), </w:t>
       </w:r>
       <w:r>
         <w:rPr>
-          <w:rFonts w:ascii="Consolas" w:cs="Consolas" w:eastAsia="Consolas" w:hAnsi="Consolas"/>
+          <w:rFonts w:ascii="Consolas" w:eastAsia="Consolas" w:hAnsi="Consolas" w:cs="Consolas"/>
           <w:sz w:val="19"/>
           <w:szCs w:val="19"/>
         </w:rPr>
-        <w:t xml:space="preserve">examples/test1.txt</w:t>
+        <w:t>examples/test1.txt</w:t>
       </w:r>
       <w:r>
         <w:t xml:space="preserve"> / </w:t>
       </w:r>
       <w:r>
         <w:rPr>
-          <w:rFonts w:ascii="Consolas" w:cs="Consolas" w:eastAsia="Consolas" w:hAnsi="Consolas"/>
+          <w:rFonts w:ascii="Consolas" w:eastAsia="Consolas" w:hAnsi="Consolas" w:cs="Consolas"/>
           <w:sz w:val="19"/>
           <w:szCs w:val="19"/>
         </w:rPr>
-        <w:t xml:space="preserve">examples/test2.txt</w:t>
+        <w:t>examples/test2.txt</w:t>
       </w:r>
       <w:r>
         <w:t xml:space="preserve"> (requests), </w:t>
       </w:r>
       <w:r>
         <w:rPr>
-          <w:rFonts w:ascii="Consolas" w:cs="Consolas" w:eastAsia="Consolas" w:hAnsi="Consolas"/>
+          <w:rFonts w:ascii="Consolas" w:eastAsia="Consolas" w:hAnsi="Consolas" w:cs="Consolas"/>
           <w:sz w:val="19"/>
           <w:szCs w:val="19"/>
         </w:rPr>
-        <w:t xml:space="preserve">examples/readme.md</w:t>
+        <w:t>examples/readme.md</w:t>
       </w:r>
       <w:r>
         <w:t xml:space="preserve"> (config), </w:t>
       </w:r>
       <w:r>
         <w:rPr>
-          <w:rFonts w:ascii="Consolas" w:cs="Consolas" w:eastAsia="Consolas" w:hAnsi="Consolas"/>
+          <w:rFonts w:ascii="Consolas" w:eastAsia="Consolas" w:hAnsi="Consolas" w:cs="Consolas"/>
           <w:sz w:val="19"/>
           <w:szCs w:val="19"/>
         </w:rPr>
-        <w:t xml:space="preserve">requirements.txt</w:t>
+        <w:t>requirements.txt</w:t>
       </w:r>
       <w:r>
         <w:t xml:space="preserve">, and </w:t>
       </w:r>
       <w:r>
         <w:rPr>
-          <w:rFonts w:ascii="Consolas" w:cs="Consolas" w:eastAsia="Consolas" w:hAnsi="Consolas"/>
+          <w:rFonts w:ascii="Consolas" w:eastAsia="Consolas" w:hAnsi="Consolas" w:cs="Consolas"/>
           <w:sz w:val="19"/>
           <w:szCs w:val="19"/>
         </w:rPr>
-        <w:t xml:space="preserve">outputs/</w:t>
-      </w:r>
-      <w:r>
-        <w:t xml:space="preserve">.</w:t>
+        <w:t>outputs/</w:t>
+      </w:r>
+      <w:r>
+        <w:t>.</w:t>
       </w:r>
     </w:p>
     <w:p>
       <w:pPr>
         <w:pStyle w:val="Heading2"/>
-        <w:spacing w:after="90" w:before="220"/>
+        <w:spacing w:before="220" w:after="90"/>
       </w:pPr>
       <w:r>
         <w:rPr>
@@ -737,7 +816,7 @@
           <w:bCs/>
           <w:color w:val="000000"/>
         </w:rPr>
-        <w:t xml:space="preserve">4. Test Case and Baseline Output</w:t>
+        <w:t>4. Test Case and Baseline Output</w:t>
       </w:r>
     </w:p>
     <w:p>
@@ -752,7 +831,7 @@
         <w:t xml:space="preserve">Test 1 — request: </w:t>
       </w:r>
       <w:r>
-        <w:t xml:space="preserve">“Build me a 10-song playlist of high-energy pop songs from the 2010s for a workout.”</w:t>
+        <w:t>“Build me a 10-song playlist of high-energy pop songs from the 2010s for a workout.”</w:t>
       </w:r>
     </w:p>
     <w:p>
@@ -764,7 +843,21 @@
           <w:b/>
           <w:bCs/>
         </w:rPr>
-        <w:t xml:space="preserve">Expected behaviour: </w:t>
+        <w:t xml:space="preserve">Expected </w:t>
+      </w:r>
+      <w:r>
+        <w:rPr>
+          <w:b/>
+          <w:bCs/>
+        </w:rPr>
+        <w:t>behavior</w:t>
+      </w:r>
+      <w:r>
+        <w:rPr>
+          <w:b/>
+          <w:bCs/>
+        </w:rPr>
+        <w:t xml:space="preserve">: </w:t>
       </w:r>
       <w:r>
         <w:t xml:space="preserve">10 distinct pop tracks released 2010–2019 with high energy (the dataset holds 2,548 candidate pop / 2010s / high-energy tracks). </w:t>
@@ -777,7 +870,7 @@
         <w:t xml:space="preserve">Actual: </w:t>
       </w:r>
       <w:r>
-        <w:t xml:space="preserve">the agent filtered to pop + 2010–2019 + energy ≥ 0.75, de-duplicated on track + artist, and returned the 10 most popular matches (e.g. “Blinding Lights – The Weeknd”, “Don’t Start Now – Dua Lipa”). ✓</w:t>
+        <w:t xml:space="preserve">the agent filtered to pop + 2010–2019 + energy ≥ 0.75, de-duplicated on track + artist, and returned the 10 most popular matches (e.g. “Blinding Lights – The Weeknd”, “Don’t Start Now – Dua Lipa”). </w:t>
       </w:r>
     </w:p>
     <w:p>
@@ -792,7 +885,7 @@
         <w:t xml:space="preserve">Test 2 — request: </w:t>
       </w:r>
       <w:r>
-        <w:t xml:space="preserve">“I want a chill 8-song playlist of calm, low-energy acoustic songs for studying.”</w:t>
+        <w:t>“I want a chill 8-song playlist of calm, low-energy acoustic songs for studying.”</w:t>
       </w:r>
     </w:p>
     <w:p>
@@ -804,7 +897,21 @@
           <w:b/>
           <w:bCs/>
         </w:rPr>
-        <w:t xml:space="preserve">Expected behaviour: </w:t>
+        <w:t xml:space="preserve">Expected </w:t>
+      </w:r>
+      <w:r>
+        <w:rPr>
+          <w:b/>
+          <w:bCs/>
+        </w:rPr>
+        <w:t>behavior</w:t>
+      </w:r>
+      <w:r>
+        <w:rPr>
+          <w:b/>
+          <w:bCs/>
+        </w:rPr>
+        <w:t xml:space="preserve">: </w:t>
       </w:r>
       <w:r>
         <w:t xml:space="preserve">8 distinct low-energy, high-acousticness tracks. </w:t>
@@ -817,20 +924,23 @@
         <w:t xml:space="preserve">Actual: </w:t>
       </w:r>
       <w:r>
-        <w:t xml:space="preserve">the agent filtered to low energy + high acousticness + low danceability (≈ energy ≤ 0.35, acousticness ≥ 0.85), de-duplicated, and returned 8 tracks (e.g. “lovely – Billie Eilish”, “Mad World – Gary Jules”). ✓</w:t>
-      </w:r>
-    </w:p>
-    <w:p>
-      <w:pPr>
-        <w:spacing w:after="40" w:before="80"/>
+        <w:t xml:space="preserve">the agent filtered to low energy + high acousticness + low danceability (≈ energy ≤ 0.35, acousticness ≥ 0.85), de-duplicated, and returned 8 tracks (e.g. “lovely – Billie Eilish”, “Mad World – Gary Jules”). </w:t>
+      </w:r>
+    </w:p>
+    <w:p>
+      <w:pPr>
+        <w:spacing w:before="80" w:after="40"/>
         <w:jc w:val="center"/>
       </w:pPr>
       <w:r>
+        <w:rPr>
+          <w:noProof/>
+        </w:rPr>
         <w:drawing>
-          <wp:inline distT="0" distB="0" distL="0" distR="0">
+          <wp:inline distT="0" distB="0" distL="0" distR="0" wp14:anchorId="6A60758D" wp14:editId="118AA294">
             <wp:extent cx="5334000" cy="1819275"/>
-            <wp:effectExtent t="0" r="0" b="0" l="0"/>
-            <wp:docPr id="1" name="" descr="" title=""/>
+            <wp:effectExtent l="0" t="0" r="0" b="0"/>
+            <wp:docPr id="1" name="Picture 1"/>
             <wp:cNvGraphicFramePr>
               <a:graphicFrameLocks xmlns:a="http://schemas.openxmlformats.org/drawingml/2006/main" noChangeAspect="1"/>
             </wp:cNvGraphicFramePr>
@@ -838,13 +948,13 @@
               <a:graphicData uri="http://schemas.openxmlformats.org/drawingml/2006/picture">
                 <pic:pic xmlns:pic="http://schemas.openxmlformats.org/drawingml/2006/picture">
                   <pic:nvPicPr>
-                    <pic:cNvPr id="0" name="" descr=""/>
+                    <pic:cNvPr id="0" name=""/>
                     <pic:cNvPicPr>
                       <a:picLocks noChangeAspect="1" noChangeArrowheads="1"/>
                     </pic:cNvPicPr>
                   </pic:nvPicPr>
                   <pic:blipFill>
-                    <a:blip r:embed="rId7" cstate="none"/>
+                    <a:blip r:embed="rId5"/>
                     <a:srcRect/>
                     <a:stretch>
                       <a:fillRect/>
@@ -875,24 +985,26 @@
         <w:rPr>
           <w:i/>
           <w:iCs/>
-          <w:color w:val="000000"/>
           <w:sz w:val="18"/>
           <w:szCs w:val="18"/>
         </w:rPr>
-        <w:t xml:space="preserve">Test 1 — high-energy 2010s pop workout playlist (your terminal).</w:t>
-      </w:r>
-    </w:p>
-    <w:p>
-      <w:pPr>
-        <w:spacing w:after="40" w:before="80"/>
+        <w:t>Test 1 — high-energy 2010s pop workout playlist (your terminal).</w:t>
+      </w:r>
+    </w:p>
+    <w:p>
+      <w:pPr>
+        <w:spacing w:before="80" w:after="40"/>
         <w:jc w:val="center"/>
       </w:pPr>
       <w:r>
+        <w:rPr>
+          <w:noProof/>
+        </w:rPr>
         <w:drawing>
-          <wp:inline distT="0" distB="0" distL="0" distR="0">
+          <wp:inline distT="0" distB="0" distL="0" distR="0" wp14:anchorId="0E8BC104" wp14:editId="2278613D">
             <wp:extent cx="5334000" cy="1866900"/>
-            <wp:effectExtent t="0" r="0" b="0" l="0"/>
-            <wp:docPr id="1" name="" descr="" title=""/>
+            <wp:effectExtent l="0" t="0" r="0" b="0"/>
+            <wp:docPr id="706504627" name="Picture 706504627"/>
             <wp:cNvGraphicFramePr>
               <a:graphicFrameLocks xmlns:a="http://schemas.openxmlformats.org/drawingml/2006/main" noChangeAspect="1"/>
             </wp:cNvGraphicFramePr>
@@ -900,13 +1012,13 @@
               <a:graphicData uri="http://schemas.openxmlformats.org/drawingml/2006/picture">
                 <pic:pic xmlns:pic="http://schemas.openxmlformats.org/drawingml/2006/picture">
                   <pic:nvPicPr>
-                    <pic:cNvPr id="0" name="" descr=""/>
+                    <pic:cNvPr id="0" name=""/>
                     <pic:cNvPicPr>
                       <a:picLocks noChangeAspect="1" noChangeArrowheads="1"/>
                     </pic:cNvPicPr>
                   </pic:nvPicPr>
                   <pic:blipFill>
-                    <a:blip r:embed="rId8" cstate="none"/>
+                    <a:blip r:embed="rId6"/>
                     <a:srcRect/>
                     <a:stretch>
                       <a:fillRect/>
@@ -937,11 +1049,10 @@
         <w:rPr>
           <w:i/>
           <w:iCs/>
-          <w:color w:val="000000"/>
           <w:sz w:val="18"/>
           <w:szCs w:val="18"/>
         </w:rPr>
-        <w:t xml:space="preserve">Test 2 — calm low-energy acoustic study playlist (your terminal).</w:t>
+        <w:t>Test 2 — calm low-energy acoustic study playlist (your terminal).</w:t>
       </w:r>
     </w:p>
     <w:p>
@@ -966,13 +1077,17 @@
         <w:t xml:space="preserve">What did not. </w:t>
       </w:r>
       <w:r>
-        <w:t xml:space="preserve">The thresholds are the model’s own ad-hoc choices and vary from run to run; genre labels are playlist-derived and noisy (some “pop” rows lean reggaeton); there is no guarantee of exactly N tracks if filters are too strict; and the baseline does not verify after the fact that each returned track actually satisfies the stated filters.</w:t>
+        <w:t xml:space="preserve">The thresholds are the model’s own ad-hoc choices and vary from run to run; genre labels are playlist-derived and noisy (some “pop” rows lean reggaeton); there </w:t>
+      </w:r>
+      <w:r>
+        <w:lastRenderedPageBreak/>
+        <w:t>is no guarantee of exactly N tracks if filters are too strict; and the baseline does not verify after the fact that each returned track actually satisfies the stated filters.</w:t>
       </w:r>
     </w:p>
     <w:p>
       <w:pPr>
         <w:pStyle w:val="Heading2"/>
-        <w:spacing w:after="90" w:before="220"/>
+        <w:spacing w:before="220" w:after="90"/>
       </w:pPr>
       <w:r>
         <w:rPr>
@@ -980,7 +1095,7 @@
           <w:bCs/>
           <w:color w:val="000000"/>
         </w:rPr>
-        <w:t xml:space="preserve">5. Reproducibility and Run Instructions</w:t>
+        <w:t>5. Reproducibility and Run Instructions</w:t>
       </w:r>
     </w:p>
     <w:p>
@@ -1001,11 +1116,11 @@
       </w:r>
       <w:r>
         <w:rPr>
-          <w:rFonts w:ascii="Consolas" w:cs="Consolas" w:eastAsia="Consolas" w:hAnsi="Consolas"/>
+          <w:rFonts w:ascii="Consolas" w:eastAsia="Consolas" w:hAnsi="Consolas" w:cs="Consolas"/>
           <w:sz w:val="19"/>
           <w:szCs w:val="19"/>
         </w:rPr>
-        <w:t xml:space="preserve">py -3.13 -m pip install -r requirements.txt</w:t>
+        <w:t>py -3.13 -m pip install -r requirements.txt</w:t>
       </w:r>
     </w:p>
     <w:p>
@@ -1029,47 +1144,47 @@
       </w:r>
       <w:r>
         <w:rPr>
-          <w:rFonts w:ascii="Consolas" w:cs="Consolas" w:eastAsia="Consolas" w:hAnsi="Consolas"/>
+          <w:rFonts w:ascii="Consolas" w:eastAsia="Consolas" w:hAnsi="Consolas" w:cs="Consolas"/>
           <w:sz w:val="19"/>
           <w:szCs w:val="19"/>
         </w:rPr>
-        <w:t xml:space="preserve">OPENAI_API_KEY</w:t>
+        <w:t>OPENAI_API_KEY</w:t>
       </w:r>
       <w:r>
         <w:t xml:space="preserve"> to a key from console.groq.com/keys and </w:t>
       </w:r>
       <w:r>
         <w:rPr>
-          <w:rFonts w:ascii="Consolas" w:cs="Consolas" w:eastAsia="Consolas" w:hAnsi="Consolas"/>
+          <w:rFonts w:ascii="Consolas" w:eastAsia="Consolas" w:hAnsi="Consolas" w:cs="Consolas"/>
           <w:sz w:val="19"/>
           <w:szCs w:val="19"/>
         </w:rPr>
-        <w:t xml:space="preserve">OPENAI_BASE_URL=https://api.groq.com/openai/v1</w:t>
+        <w:t>OPENAI_BASE_URL=https://api.groq.com/openai/v1</w:t>
       </w:r>
       <w:r>
         <w:t xml:space="preserve">. (For OpenAI instead: set only </w:t>
       </w:r>
       <w:r>
         <w:rPr>
-          <w:rFonts w:ascii="Consolas" w:cs="Consolas" w:eastAsia="Consolas" w:hAnsi="Consolas"/>
+          <w:rFonts w:ascii="Consolas" w:eastAsia="Consolas" w:hAnsi="Consolas" w:cs="Consolas"/>
           <w:sz w:val="19"/>
           <w:szCs w:val="19"/>
         </w:rPr>
-        <w:t xml:space="preserve">OPENAI_API_KEY</w:t>
+        <w:t>OPENAI_API_KEY</w:t>
       </w:r>
       <w:r>
         <w:t xml:space="preserve"> and use </w:t>
       </w:r>
       <w:r>
         <w:rPr>
-          <w:rFonts w:ascii="Consolas" w:cs="Consolas" w:eastAsia="Consolas" w:hAnsi="Consolas"/>
+          <w:rFonts w:ascii="Consolas" w:eastAsia="Consolas" w:hAnsi="Consolas" w:cs="Consolas"/>
           <w:sz w:val="19"/>
           <w:szCs w:val="19"/>
         </w:rPr>
-        <w:t xml:space="preserve">--model gpt-4o-mini</w:t>
-      </w:r>
-      <w:r>
-        <w:t xml:space="preserve">.)</w:t>
+        <w:t>--model gpt-4o-mini</w:t>
+      </w:r>
+      <w:r>
+        <w:t>.)</w:t>
       </w:r>
     </w:p>
     <w:p>
@@ -1093,14 +1208,14 @@
       </w:r>
       <w:r>
         <w:rPr>
-          <w:rFonts w:ascii="Consolas" w:cs="Consolas" w:eastAsia="Consolas" w:hAnsi="Consolas"/>
+          <w:rFonts w:ascii="Consolas" w:eastAsia="Consolas" w:hAnsi="Consolas" w:cs="Consolas"/>
           <w:sz w:val="19"/>
           <w:szCs w:val="19"/>
         </w:rPr>
-        <w:t xml:space="preserve">examples/spotify_songs.csv</w:t>
-      </w:r>
-      <w:r>
-        <w:t xml:space="preserve">; auto-downloaded from GitHub on first run if missing (no Kaggle account needed).</w:t>
+        <w:t>examples/spotify_songs.csv</w:t>
+      </w:r>
+      <w:r>
+        <w:t>; auto-downloaded from GitHub on first run if missing (no Kaggle account needed).</w:t>
       </w:r>
     </w:p>
     <w:p>
@@ -1121,11 +1236,11 @@
       </w:r>
       <w:r>
         <w:rPr>
-          <w:rFonts w:ascii="Consolas" w:cs="Consolas" w:eastAsia="Consolas" w:hAnsi="Consolas"/>
+          <w:rFonts w:ascii="Consolas" w:eastAsia="Consolas" w:hAnsi="Consolas" w:cs="Consolas"/>
           <w:sz w:val="19"/>
           <w:szCs w:val="19"/>
         </w:rPr>
-        <w:t xml:space="preserve">py -3.13 run_baseline.py --input examples/test1.txt --model openai/gpt-oss-120b</w:t>
+        <w:t>py -3.13 run_baseline.py --input examples/test1.txt --model openai/gpt-oss-120b</w:t>
       </w:r>
     </w:p>
     <w:p>
@@ -1146,11 +1261,11 @@
       </w:r>
       <w:r>
         <w:rPr>
-          <w:rFonts w:ascii="Consolas" w:cs="Consolas" w:eastAsia="Consolas" w:hAnsi="Consolas"/>
+          <w:rFonts w:ascii="Consolas" w:eastAsia="Consolas" w:hAnsi="Consolas" w:cs="Consolas"/>
           <w:sz w:val="19"/>
           <w:szCs w:val="19"/>
         </w:rPr>
-        <w:t xml:space="preserve">examples/*.txt</w:t>
+        <w:t>examples/*.txt</w:t>
       </w:r>
       <w:r>
         <w:t xml:space="preserve">. </w:t>
@@ -1167,14 +1282,14 @@
       </w:r>
       <w:r>
         <w:rPr>
-          <w:rFonts w:ascii="Consolas" w:cs="Consolas" w:eastAsia="Consolas" w:hAnsi="Consolas"/>
+          <w:rFonts w:ascii="Consolas" w:eastAsia="Consolas" w:hAnsi="Consolas" w:cs="Consolas"/>
           <w:sz w:val="19"/>
           <w:szCs w:val="19"/>
         </w:rPr>
-        <w:t xml:space="preserve">outputs/&lt;input-name&gt;.out.txt</w:t>
-      </w:r>
-      <w:r>
-        <w:t xml:space="preserve">.</w:t>
+        <w:t>outputs/&lt;input-name&gt;.out.txt</w:t>
+      </w:r>
+      <w:r>
+        <w:t>.</w:t>
       </w:r>
     </w:p>
     <w:p>
@@ -1194,13 +1309,13 @@
         <w:t xml:space="preserve">Known limitations: </w:t>
       </w:r>
       <w:r>
-        <w:t xml:space="preserve">the model must support tool calling; free tiers are rate-limited (retry on HTTP 429).</w:t>
+        <w:t>the model must support tool calling; free tiers are rate-limited (retry on HTTP 429).</w:t>
       </w:r>
     </w:p>
     <w:p>
       <w:pPr>
         <w:pStyle w:val="Heading2"/>
-        <w:spacing w:after="90" w:before="220"/>
+        <w:spacing w:before="220" w:after="90"/>
       </w:pPr>
       <w:r>
         <w:rPr>
@@ -1208,7 +1323,7 @@
           <w:bCs/>
           <w:color w:val="000000"/>
         </w:rPr>
-        <w:t xml:space="preserve">6. Initial Evaluation Plan</w:t>
+        <w:t>6. Initial Evaluation Plan</w:t>
       </w:r>
     </w:p>
     <w:p>
@@ -1216,7 +1331,7 @@
         <w:spacing w:after="100"/>
       </w:pPr>
       <w:r>
-        <w:t xml:space="preserve">The improved system will be compared to this baseline on a set of playlist requests, each paired with a machine-checkable set of intended constraints:</w:t>
+        <w:t>The improved system will be compared to this baseline on a set of playlist requests, each paired with a machine-checkable set of intended constraints:</w:t>
       </w:r>
     </w:p>
     <w:p>
@@ -1236,7 +1351,7 @@
         <w:t xml:space="preserve">Constraint-satisfaction rate </w:t>
       </w:r>
       <w:r>
-        <w:t xml:space="preserve">— fraction of returned tracks that meet every stated constraint (the primary metric).</w:t>
+        <w:t>— fraction of returned tracks that meet every stated constraint (the primary metric).</w:t>
       </w:r>
     </w:p>
     <w:p>
@@ -1256,7 +1371,7 @@
         <w:t xml:space="preserve">Count correctness </w:t>
       </w:r>
       <w:r>
-        <w:t xml:space="preserve">— returned track count equals the requested count.</w:t>
+        <w:t>— returned track count equals the requested count.</w:t>
       </w:r>
     </w:p>
     <w:p>
@@ -1276,7 +1391,7 @@
         <w:t xml:space="preserve">Duplicate &amp; hallucination rate </w:t>
       </w:r>
       <w:r>
-        <w:t xml:space="preserve">— duplicate tracks, and tracks not present in the dataset.</w:t>
+        <w:t>— duplicate tracks, and tracks not present in the dataset.</w:t>
       </w:r>
     </w:p>
     <w:p>
@@ -1296,7 +1411,7 @@
         <w:t xml:space="preserve">Diversity </w:t>
       </w:r>
       <w:r>
-        <w:t xml:space="preserve">— number of unique artists in the playlist.</w:t>
+        <w:t>— number of unique artists in the playlist.</w:t>
       </w:r>
     </w:p>
     <w:p>
@@ -1316,7 +1431,7 @@
         <w:t xml:space="preserve">Latency, cost, tool-failure rate </w:t>
       </w:r>
       <w:r>
-        <w:t xml:space="preserve">— wall-clock time, tokens / tool-steps used, and unrecovered code errors.</w:t>
+        <w:t>— wall-clock time, tokens / tool-steps used, and unrecovered code errors.</w:t>
       </w:r>
     </w:p>
     <w:p>
@@ -1336,7 +1451,7 @@
         <w:t xml:space="preserve">Optional human / LLM-as-judge </w:t>
       </w:r>
       <w:r>
-        <w:t xml:space="preserve">— rating of how well the playlist fits the requested vibe.</w:t>
+        <w:t>— rating of how well the playlist fits the requested vibe.</w:t>
       </w:r>
     </w:p>
     <w:p>
@@ -1344,13 +1459,13 @@
         <w:spacing w:after="100"/>
       </w:pPr>
       <w:r>
-        <w:t xml:space="preserve">Evidence of improvement: higher constraint-satisfaction and lower duplicate / hallucination rates than the baseline, reliably correct counts, better vibe-fit ratings, and fewer wasted tool steps.</w:t>
+        <w:t>Evidence of improvement: higher constraint-satisfaction and lower duplicate / hallucination rates than the baseline, reliably correct counts, better vibe-fit ratings, and fewer wasted tool steps.</w:t>
       </w:r>
     </w:p>
     <w:p>
       <w:pPr>
         <w:pStyle w:val="Heading2"/>
-        <w:spacing w:after="90" w:before="220"/>
+        <w:spacing w:before="220" w:after="90"/>
       </w:pPr>
       <w:r>
         <w:rPr>
@@ -1358,7 +1473,7 @@
           <w:bCs/>
           <w:color w:val="000000"/>
         </w:rPr>
-        <w:t xml:space="preserve">7. Limitations and Next Steps</w:t>
+        <w:t>7. Limitations and Next Steps</w:t>
       </w:r>
     </w:p>
     <w:p>
@@ -1373,7 +1488,7 @@
         <w:t xml:space="preserve">Known weaknesses. </w:t>
       </w:r>
       <w:r>
-        <w:t xml:space="preserve">Feature thresholds are chosen ad-hoc and are inconsistent between runs; genre labels are noisy; there is no post-hoc validation that returned tracks satisfy the request; model-written code is executed without a real sandbox; only one dataset is supported; there is no personalization.</w:t>
+        <w:t>Feature thresholds are chosen ad-hoc and are inconsistent between runs; genre labels are noisy; there is no post-hoc validation that returned tracks satisfy the request; model-written code is executed without a real sandbox; only one dataset is supported; there is no personalization.</w:t>
       </w:r>
     </w:p>
     <w:p>
@@ -1388,7 +1503,7 @@
         <w:t xml:space="preserve">Expected failure cases. </w:t>
       </w:r>
       <w:r>
-        <w:t xml:space="preserve">Over-strict filters returning fewer than N tracks; ambiguous requests (“sad but not too sad”); non-English or regional requests; and requests that depend on information not in the audio features (e.g. “songs about summer”). One such case was observed during testing: on the test-2 request the agent looped on near-identical queries and exhausted its step budget without finalizing, which prompted raising the bound from 8 to 12 steps and adding a “be decisive” instruction — a mitigation, not a full fix.</w:t>
+        <w:t>Over-strict filters returning fewer than N tracks; ambiguous requests (“sad but not too sad”); non-English or regional requests; and requests that depend on information not in the audio features (e.g. “songs about summer”). One such case was observed during testing: on the test-2 request the agent looped on near-identical queries and exhausted its step budget without finalizing, which prompted raising the bound from 8 to 12 steps and adding a “be decisive” instruction — a mitigation, not a full fix.</w:t>
       </w:r>
     </w:p>
     <w:p>
@@ -1403,7 +1518,7 @@
         <w:t xml:space="preserve">Next phase. </w:t>
       </w:r>
       <w:r>
-        <w:t xml:space="preserve">Add a validation-and-repair step that checks each track against parsed constraints; standardize the language-to-threshold mapping; guarantee exactly-N with graceful constraint relaxation; connect to the real Spotify API/MCP to create the playlist in the user’s account; and grow the evaluation into a labeled request suite.</w:t>
+        <w:t>Add a validation-and-repair step that checks each track against parsed constraints; standardize the language-to-threshold mapping; guarantee exactly-N with graceful constraint relaxation; connect to the real Spotify API/MCP to create the playlist in the user’s account; and grow the evaluation into a labeled request suite.</w:t>
       </w:r>
     </w:p>
     <w:p>
@@ -1418,102 +1533,26 @@
         <w:t xml:space="preserve">Risks &amp; help needed. </w:t>
       </w:r>
       <w:r>
-        <w:t xml:space="preserve">Model availability / rate limits and unsafe code execution are the main risks; defining ground-truth constraints for fuzzy requests takes care. The project would benefit from stable API access and a small labeled request→constraint benchmark.</w:t>
+        <w:t>Model availability / rate limits and unsafe code execution are the main risks; defining ground-truth constraints for fuzzy requests takes care. The project would benefit from stable API access and a small labeled request→constraint benchmark.</w:t>
       </w:r>
     </w:p>
     <w:sectPr>
-      <w:pgSz w:w="12240" w:h="15840" w:orient="portrait"/>
+      <w:pgSz w:w="12240" w:h="15840"/>
       <w:pgMar w:top="1080" w:right="1080" w:bottom="1080" w:left="1080" w:header="708" w:footer="708" w:gutter="0"/>
-      <w:pgNumType/>
+      <w:cols w:space="720"/>
       <w:docGrid w:linePitch="360"/>
     </w:sectPr>
   </w:body>
 </w:document>
 </file>
 
-<file path=word/comments.xml><?xml version="1.0" encoding="utf-8"?>
-<w:comments xmlns:cx="http://schemas.microsoft.com/office/drawing/2014/chartex" xmlns:cx1="http://schemas.microsoft.com/office/drawing/2015/9/8/chartex" xmlns:cx2="http://schemas.microsoft.com/office/drawing/2015/10/21/chartex" xmlns:cx3="http://schemas.microsoft.com/office/drawing/2016/5/9/chartex" xmlns:cx4="http://schemas.microsoft.com/office/drawing/2016/5/10/chartex" xmlns:cx5="http://schemas.microsoft.com/office/drawing/2016/5/11/chartex" xmlns:cx6="http://schemas.microsoft.com/office/drawing/2016/5/12/chartex" xmlns:cx7="http://schemas.microsoft.com/office/drawing/2016/5/13/chartex" xmlns:cx8="http://schemas.microsoft.com/office/drawing/2016/5/14/chartex" xmlns:mc="http://schemas.openxmlformats.org/markup-compatibility/2006" xmlns:aink="http://schemas.microsoft.com/office/drawing/2016/ink" xmlns:am3d="http://schemas.microsoft.com/office/drawing/2017/model3d" xmlns:o="urn:schemas-microsoft-com:office:office" xmlns:r="http://schemas.openxmlformats.org/officeDocument/2006/relationships" xmlns:m="http://schemas.openxmlformats.org/officeDocument/2006/math" xmlns:v="urn:schemas-microsoft-com:vml" xmlns:wp14="http://schemas.microsoft.com/office/word/2010/wordprocessingDrawing" xmlns:wp="http://schemas.openxmlformats.org/drawingml/2006/wordprocessingDrawing" xmlns:w10="urn:schemas-microsoft-com:office:word" xmlns:w="http://schemas.openxmlformats.org/wordprocessingml/2006/main" xmlns:w14="http://schemas.microsoft.com/office/word/2010/wordml" xmlns:w15="http://schemas.microsoft.com/office/word/2012/wordml" xmlns:w16cex="http://schemas.microsoft.com/office/word/2018/wordml/cex" xmlns:w16cid="http://schemas.microsoft.com/office/word/2016/wordml/cid" xmlns:w16="http://schemas.microsoft.com/office/word/2018/wordml" xmlns:w16sdtdh="http://schemas.microsoft.com/office/word/2020/wordml/sdtdatahash" xmlns:w16se="http://schemas.microsoft.com/office/word/2015/wordml/symex" xmlns:wpg="http://schemas.microsoft.com/office/word/2010/wordprocessingGroup" xmlns:wpi="http://schemas.microsoft.com/office/word/2010/wordprocessingInk" xmlns:wne="http://schemas.microsoft.com/office/word/2006/wordml" xmlns:wps="http://schemas.microsoft.com/office/word/2010/wordprocessingShape"/>
-</file>
-
-<file path=word/endnotes.xml><?xml version="1.0" encoding="utf-8"?>
-<w:endnotes xmlns:wpc="http://schemas.microsoft.com/office/word/2010/wordprocessingCanvas" xmlns:mc="http://schemas.openxmlformats.org/markup-compatibility/2006" xmlns:o="urn:schemas-microsoft-com:office:office" xmlns:r="http://schemas.openxmlformats.org/officeDocument/2006/relationships" xmlns:m="http://schemas.openxmlformats.org/officeDocument/2006/math" xmlns:v="urn:schemas-microsoft-com:vml" xmlns:wp14="http://schemas.microsoft.com/office/word/2010/wordprocessingDrawing" xmlns:wp="http://schemas.openxmlformats.org/drawingml/2006/wordprocessingDrawing" xmlns:w10="urn:schemas-microsoft-com:office:word" xmlns:w="http://schemas.openxmlformats.org/wordprocessingml/2006/main" xmlns:w14="http://schemas.microsoft.com/office/word/2010/wordml" xmlns:w15="http://schemas.microsoft.com/office/word/2012/wordml" xmlns:wpg="http://schemas.microsoft.com/office/word/2010/wordprocessingGroup" xmlns:wpi="http://schemas.microsoft.com/office/word/2010/wordprocessingInk" xmlns:wne="http://schemas.microsoft.com/office/word/2006/wordml" xmlns:wps="http://schemas.microsoft.com/office/word/2010/wordprocessingShape" mc:Ignorable="w14 w15 wp14">
-  <w:endnote w:type="separator" w:id="-1">
-    <w:p>
-      <w:pPr>
-        <w:spacing w:after="0" w:line="240" w:lineRule="auto"/>
-      </w:pPr>
-      <w:r>
-        <w:rPr>
-          <w:rStyle w:val="EndnoteReference"/>
-        </w:rPr>
-        <w:endnoteRef/>
-      </w:r>
-      <w:r>
-        <w:separator/>
-      </w:r>
-    </w:p>
-  </w:endnote>
-  <w:endnote w:type="continuationSeparator" w:id="0">
-    <w:p>
-      <w:pPr>
-        <w:spacing w:after="0" w:line="240" w:lineRule="auto"/>
-      </w:pPr>
-      <w:r>
-        <w:rPr>
-          <w:rStyle w:val="EndnoteReference"/>
-        </w:rPr>
-        <w:endnoteRef/>
-      </w:r>
-      <w:r>
-        <w:continuationSeparator/>
-      </w:r>
-    </w:p>
-  </w:endnote>
-</w:endnotes>
-</file>
-
-<file path=word/footnotes.xml><?xml version="1.0" encoding="utf-8"?>
-<w:footnotes xmlns:wpc="http://schemas.microsoft.com/office/word/2010/wordprocessingCanvas" xmlns:mc="http://schemas.openxmlformats.org/markup-compatibility/2006" xmlns:o="urn:schemas-microsoft-com:office:office" xmlns:r="http://schemas.openxmlformats.org/officeDocument/2006/relationships" xmlns:m="http://schemas.openxmlformats.org/officeDocument/2006/math" xmlns:v="urn:schemas-microsoft-com:vml" xmlns:wp14="http://schemas.microsoft.com/office/word/2010/wordprocessingDrawing" xmlns:wp="http://schemas.openxmlformats.org/drawingml/2006/wordprocessingDrawing" xmlns:w10="urn:schemas-microsoft-com:office:word" xmlns:w="http://schemas.openxmlformats.org/wordprocessingml/2006/main" xmlns:w14="http://schemas.microsoft.com/office/word/2010/wordml" xmlns:w15="http://schemas.microsoft.com/office/word/2012/wordml" xmlns:wpg="http://schemas.microsoft.com/office/word/2010/wordprocessingGroup" xmlns:wpi="http://schemas.microsoft.com/office/word/2010/wordprocessingInk" xmlns:wne="http://schemas.microsoft.com/office/word/2006/wordml" xmlns:wps="http://schemas.microsoft.com/office/word/2010/wordprocessingShape" mc:Ignorable="w14 w15 wp14">
-  <w:footnote w:type="separator" w:id="-1">
-    <w:p>
-      <w:pPr>
-        <w:spacing w:after="0" w:line="240" w:lineRule="auto"/>
-      </w:pPr>
-      <w:r>
-        <w:rPr>
-          <w:rStyle w:val="FootnoteReference"/>
-        </w:rPr>
-        <w:footnoteRef/>
-      </w:r>
-      <w:r>
-        <w:separator/>
-      </w:r>
-    </w:p>
-  </w:footnote>
-  <w:footnote w:type="continuationSeparator" w:id="0">
-    <w:p>
-      <w:pPr>
-        <w:spacing w:after="0" w:line="240" w:lineRule="auto"/>
-      </w:pPr>
-      <w:r>
-        <w:rPr>
-          <w:rStyle w:val="FootnoteReference"/>
-        </w:rPr>
-        <w:footnoteRef/>
-      </w:r>
-      <w:r>
-        <w:continuationSeparator/>
-      </w:r>
-    </w:p>
-  </w:footnote>
-</w:footnotes>
-</file>
-
 <file path=word/numbering.xml><?xml version="1.0" encoding="utf-8"?>
-<w:numbering xmlns:wpc="http://schemas.microsoft.com/office/word/2010/wordprocessingCanvas" xmlns:mc="http://schemas.openxmlformats.org/markup-compatibility/2006" xmlns:o="urn:schemas-microsoft-com:office:office" xmlns:r="http://schemas.openxmlformats.org/officeDocument/2006/relationships" xmlns:m="http://schemas.openxmlformats.org/officeDocument/2006/math" xmlns:v="urn:schemas-microsoft-com:vml" xmlns:wp14="http://schemas.microsoft.com/office/word/2010/wordprocessingDrawing" xmlns:wp="http://schemas.openxmlformats.org/drawingml/2006/wordprocessingDrawing" xmlns:w10="urn:schemas-microsoft-com:office:word" xmlns:w="http://schemas.openxmlformats.org/wordprocessingml/2006/main" xmlns:w14="http://schemas.microsoft.com/office/word/2010/wordml" xmlns:w15="http://schemas.microsoft.com/office/word/2012/wordml" xmlns:wpg="http://schemas.microsoft.com/office/word/2010/wordprocessingGroup" xmlns:wpi="http://schemas.microsoft.com/office/word/2010/wordprocessingInk" xmlns:wne="http://schemas.microsoft.com/office/word/2006/wordml" xmlns:wps="http://schemas.microsoft.com/office/word/2010/wordprocessingShape" mc:Ignorable="w14 w15 wp14">
-  <w:abstractNum w:abstractNumId="1" w15:restartNumberingAfterBreak="0">
+<w:numbering xmlns:wpc="http://schemas.microsoft.com/office/word/2010/wordprocessingCanvas" xmlns:cx="http://schemas.microsoft.com/office/drawing/2014/chartex" xmlns:cx1="http://schemas.microsoft.com/office/drawing/2015/9/8/chartex" xmlns:cx2="http://schemas.microsoft.com/office/drawing/2015/10/21/chartex" xmlns:cx3="http://schemas.microsoft.com/office/drawing/2016/5/9/chartex" xmlns:cx4="http://schemas.microsoft.com/office/drawing/2016/5/10/chartex" xmlns:cx5="http://schemas.microsoft.com/office/drawing/2016/5/11/chartex" xmlns:cx6="http://schemas.microsoft.com/office/drawing/2016/5/12/chartex" xmlns:cx7="http://schemas.microsoft.com/office/drawing/2016/5/13/chartex" xmlns:cx8="http://schemas.microsoft.com/office/drawing/2016/5/14/chartex" xmlns:mc="http://schemas.openxmlformats.org/markup-compatibility/2006" xmlns:aink="http://schemas.microsoft.com/office/drawing/2016/ink" xmlns:am3d="http://schemas.microsoft.com/office/drawing/2017/model3d" xmlns:o="urn:schemas-microsoft-com:office:office" xmlns:oel="http://schemas.microsoft.com/office/2019/extlst" xmlns:r="http://schemas.openxmlformats.org/officeDocument/2006/relationships" xmlns:m="http://schemas.openxmlformats.org/officeDocument/2006/math" xmlns:v="urn:schemas-microsoft-com:vml" xmlns:wp14="http://schemas.microsoft.com/office/word/2010/wordprocessingDrawing" xmlns:wp="http://schemas.openxmlformats.org/drawingml/2006/wordprocessingDrawing" xmlns:w10="urn:schemas-microsoft-com:office:word" xmlns:w="http://schemas.openxmlformats.org/wordprocessingml/2006/main" xmlns:w14="http://schemas.microsoft.com/office/word/2010/wordml" xmlns:w15="http://schemas.microsoft.com/office/word/2012/wordml" xmlns:w16cex="http://schemas.microsoft.com/office/word/2018/wordml/cex" xmlns:w16cid="http://schemas.microsoft.com/office/word/2016/wordml/cid" xmlns:w16="http://schemas.microsoft.com/office/word/2018/wordml" xmlns:w16du="http://schemas.microsoft.com/office/word/2023/wordml/word16du" xmlns:w16sdtdh="http://schemas.microsoft.com/office/word/2020/wordml/sdtdatahash" xmlns:w16sdtfl="http://schemas.microsoft.com/office/word/2024/wordml/sdtformatlock" xmlns:w16se="http://schemas.microsoft.com/office/word/2015/wordml/symex" xmlns:wpg="http://schemas.microsoft.com/office/word/2010/wordprocessingGroup" xmlns:wpi="http://schemas.microsoft.com/office/word/2010/wordprocessingInk" xmlns:wne="http://schemas.microsoft.com/office/word/2006/wordml" xmlns:wps="http://schemas.microsoft.com/office/word/2010/wordprocessingShape" mc:Ignorable="w14 w15 w16se w16cid w16 w16cex w16sdtdh w16sdtfl w16du wp14">
+  <w:abstractNum w:abstractNumId="0" w15:restartNumberingAfterBreak="0">
+    <w:nsid w:val="69BB7046"/>
     <w:multiLevelType w:val="hybridMultilevel"/>
-    <w:lvl w:ilvl="0" w15:tentative="1">
+    <w:tmpl w:val="DA0A71FA"/>
+    <w:lvl w:ilvl="0" w:tplc="DF681E1C">
       <w:start w:val="1"/>
       <w:numFmt w:val="bullet"/>
       <w:lvlText w:val="●"/>
@@ -1522,7 +1561,7 @@
         <w:ind w:left="720" w:hanging="360"/>
       </w:pPr>
     </w:lvl>
-    <w:lvl w:ilvl="1" w15:tentative="1">
+    <w:lvl w:ilvl="1" w:tplc="88325EBA">
       <w:start w:val="1"/>
       <w:numFmt w:val="bullet"/>
       <w:lvlText w:val="○"/>
@@ -1531,7 +1570,7 @@
         <w:ind w:left="1440" w:hanging="360"/>
       </w:pPr>
     </w:lvl>
-    <w:lvl w:ilvl="2" w15:tentative="1">
+    <w:lvl w:ilvl="2" w:tplc="68D08434">
       <w:start w:val="1"/>
       <w:numFmt w:val="bullet"/>
       <w:lvlText w:val="■"/>
@@ -1540,7 +1579,7 @@
         <w:ind w:left="2160" w:hanging="360"/>
       </w:pPr>
     </w:lvl>
-    <w:lvl w:ilvl="3" w15:tentative="1">
+    <w:lvl w:ilvl="3" w:tplc="1D48B148">
       <w:start w:val="1"/>
       <w:numFmt w:val="bullet"/>
       <w:lvlText w:val="●"/>
@@ -1549,7 +1588,7 @@
         <w:ind w:left="2880" w:hanging="360"/>
       </w:pPr>
     </w:lvl>
-    <w:lvl w:ilvl="4" w15:tentative="1">
+    <w:lvl w:ilvl="4" w:tplc="AD80A13C">
       <w:start w:val="1"/>
       <w:numFmt w:val="bullet"/>
       <w:lvlText w:val="○"/>
@@ -1558,7 +1597,7 @@
         <w:ind w:left="3600" w:hanging="360"/>
       </w:pPr>
     </w:lvl>
-    <w:lvl w:ilvl="5" w15:tentative="1">
+    <w:lvl w:ilvl="5" w:tplc="0426A860">
       <w:start w:val="1"/>
       <w:numFmt w:val="bullet"/>
       <w:lvlText w:val="■"/>
@@ -1567,7 +1606,7 @@
         <w:ind w:left="4320" w:hanging="360"/>
       </w:pPr>
     </w:lvl>
-    <w:lvl w:ilvl="6" w15:tentative="1">
+    <w:lvl w:ilvl="6" w:tplc="D5A4783C">
       <w:start w:val="1"/>
       <w:numFmt w:val="bullet"/>
       <w:lvlText w:val="●"/>
@@ -1576,7 +1615,7 @@
         <w:ind w:left="5040" w:hanging="360"/>
       </w:pPr>
     </w:lvl>
-    <w:lvl w:ilvl="7" w15:tentative="1">
+    <w:lvl w:ilvl="7" w:tplc="07407116">
       <w:start w:val="1"/>
       <w:numFmt w:val="bullet"/>
       <w:lvlText w:val="●"/>
@@ -1585,7 +1624,7 @@
         <w:ind w:left="5760" w:hanging="360"/>
       </w:pPr>
     </w:lvl>
-    <w:lvl w:ilvl="8" w15:tentative="1">
+    <w:lvl w:ilvl="8" w:tplc="E8D839FC">
       <w:start w:val="1"/>
       <w:numFmt w:val="bullet"/>
       <w:lvlText w:val="●"/>
@@ -1595,9 +1634,11 @@
       </w:pPr>
     </w:lvl>
   </w:abstractNum>
-  <w:abstractNum w:abstractNumId="2" w15:restartNumberingAfterBreak="0">
+  <w:abstractNum w:abstractNumId="1" w15:restartNumberingAfterBreak="0">
+    <w:nsid w:val="76671EB9"/>
     <w:multiLevelType w:val="hybridMultilevel"/>
-    <w:lvl w:ilvl="0" w15:tentative="1">
+    <w:tmpl w:val="C8EEFAE6"/>
+    <w:lvl w:ilvl="0" w:tplc="FF1A2C34">
       <w:start w:val="1"/>
       <w:numFmt w:val="bullet"/>
       <w:lvlText w:val="•"/>
@@ -1606,15 +1647,55 @@
         <w:ind w:left="360" w:hanging="200"/>
       </w:pPr>
     </w:lvl>
+    <w:lvl w:ilvl="1" w:tplc="355C68C8">
+      <w:numFmt w:val="decimal"/>
+      <w:lvlText w:val=""/>
+      <w:lvlJc w:val="left"/>
+    </w:lvl>
+    <w:lvl w:ilvl="2" w:tplc="623CF57E">
+      <w:numFmt w:val="decimal"/>
+      <w:lvlText w:val=""/>
+      <w:lvlJc w:val="left"/>
+    </w:lvl>
+    <w:lvl w:ilvl="3" w:tplc="9BA23B5A">
+      <w:numFmt w:val="decimal"/>
+      <w:lvlText w:val=""/>
+      <w:lvlJc w:val="left"/>
+    </w:lvl>
+    <w:lvl w:ilvl="4" w:tplc="3E7457DA">
+      <w:numFmt w:val="decimal"/>
+      <w:lvlText w:val=""/>
+      <w:lvlJc w:val="left"/>
+    </w:lvl>
+    <w:lvl w:ilvl="5" w:tplc="B524C354">
+      <w:numFmt w:val="decimal"/>
+      <w:lvlText w:val=""/>
+      <w:lvlJc w:val="left"/>
+    </w:lvl>
+    <w:lvl w:ilvl="6" w:tplc="F61E94B4">
+      <w:numFmt w:val="decimal"/>
+      <w:lvlText w:val=""/>
+      <w:lvlJc w:val="left"/>
+    </w:lvl>
+    <w:lvl w:ilvl="7" w:tplc="44C6D432">
+      <w:numFmt w:val="decimal"/>
+      <w:lvlText w:val=""/>
+      <w:lvlJc w:val="left"/>
+    </w:lvl>
+    <w:lvl w:ilvl="8" w:tplc="2834AD6E">
+      <w:numFmt w:val="decimal"/>
+      <w:lvlText w:val=""/>
+      <w:lvlJc w:val="left"/>
+    </w:lvl>
   </w:abstractNum>
-  <w:num w:numId="1">
-    <w:abstractNumId w:val="1"/>
+  <w:num w:numId="1" w16cid:durableId="1169097485">
+    <w:abstractNumId w:val="0"/>
     <w:lvlOverride w:ilvl="0">
       <w:startOverride w:val="1"/>
     </w:lvlOverride>
   </w:num>
-  <w:num w:numId="2">
-    <w:abstractNumId w:val="2"/>
+  <w:num w:numId="2" w16cid:durableId="1340617100">
+    <w:abstractNumId w:val="1"/>
     <w:lvlOverride w:ilvl="0">
       <w:startOverride w:val="1"/>
     </w:lvlOverride>
@@ -1623,33 +1704,408 @@
 </file>
 
 <file path=word/styles.xml><?xml version="1.0" encoding="utf-8"?>
-<w:styles xmlns:mc="http://schemas.openxmlformats.org/markup-compatibility/2006" xmlns:r="http://schemas.openxmlformats.org/officeDocument/2006/relationships" xmlns:w="http://schemas.openxmlformats.org/wordprocessingml/2006/main" xmlns:w14="http://schemas.microsoft.com/office/word/2010/wordml" xmlns:w15="http://schemas.microsoft.com/office/word/2012/wordml" mc:Ignorable="w14 w15">
+<w:styles xmlns:mc="http://schemas.openxmlformats.org/markup-compatibility/2006" xmlns:r="http://schemas.openxmlformats.org/officeDocument/2006/relationships" xmlns:w="http://schemas.openxmlformats.org/wordprocessingml/2006/main" xmlns:w14="http://schemas.microsoft.com/office/word/2010/wordml" xmlns:w15="http://schemas.microsoft.com/office/word/2012/wordml" xmlns:w16cex="http://schemas.microsoft.com/office/word/2018/wordml/cex" xmlns:w16cid="http://schemas.microsoft.com/office/word/2016/wordml/cid" xmlns:w16="http://schemas.microsoft.com/office/word/2018/wordml" xmlns:w16du="http://schemas.microsoft.com/office/word/2023/wordml/word16du" xmlns:w16sdtdh="http://schemas.microsoft.com/office/word/2020/wordml/sdtdatahash" xmlns:w16sdtfl="http://schemas.microsoft.com/office/word/2024/wordml/sdtformatlock" xmlns:w16se="http://schemas.microsoft.com/office/word/2015/wordml/symex" mc:Ignorable="w14 w15 w16se w16cid w16 w16cex w16sdtdh w16sdtfl w16du">
   <w:docDefaults>
     <w:rPrDefault>
       <w:rPr>
-        <w:rFonts w:ascii="Calibri" w:cs="Calibri" w:eastAsia="Calibri" w:hAnsi="Calibri"/>
+        <w:rFonts w:ascii="Calibri" w:eastAsia="Calibri" w:hAnsi="Calibri" w:cs="Calibri"/>
         <w:color w:val="000000"/>
         <w:sz w:val="21"/>
         <w:szCs w:val="21"/>
+        <w:lang w:val="en-US" w:eastAsia="en-US" w:bidi="ar-SA"/>
       </w:rPr>
     </w:rPrDefault>
     <w:pPrDefault/>
   </w:docDefaults>
-  <w:style w:type="paragraph" w:styleId="Title">
-    <w:name w:val="Title"/>
-    <w:basedOn w:val="Normal"/>
-    <w:next w:val="Normal"/>
+  <w:latentStyles w:defLockedState="0" w:defUIPriority="99" w:defSemiHidden="0" w:defUnhideWhenUsed="0" w:defQFormat="0" w:count="376">
+    <w:lsdException w:name="Normal" w:uiPriority="0" w:qFormat="1"/>
+    <w:lsdException w:name="heading 1" w:uiPriority="9" w:qFormat="1"/>
+    <w:lsdException w:name="heading 2" w:semiHidden="1" w:uiPriority="9" w:unhideWhenUsed="1" w:qFormat="1"/>
+    <w:lsdException w:name="heading 3" w:semiHidden="1" w:uiPriority="9" w:unhideWhenUsed="1" w:qFormat="1"/>
+    <w:lsdException w:name="heading 4" w:semiHidden="1" w:uiPriority="9" w:unhideWhenUsed="1" w:qFormat="1"/>
+    <w:lsdException w:name="heading 5" w:semiHidden="1" w:uiPriority="9" w:unhideWhenUsed="1" w:qFormat="1"/>
+    <w:lsdException w:name="heading 6" w:semiHidden="1" w:uiPriority="9" w:unhideWhenUsed="1" w:qFormat="1"/>
+    <w:lsdException w:name="heading 7" w:semiHidden="1" w:uiPriority="9" w:unhideWhenUsed="1" w:qFormat="1"/>
+    <w:lsdException w:name="heading 8" w:semiHidden="1" w:uiPriority="9" w:unhideWhenUsed="1" w:qFormat="1"/>
+    <w:lsdException w:name="heading 9" w:semiHidden="1" w:uiPriority="9" w:unhideWhenUsed="1" w:qFormat="1"/>
+    <w:lsdException w:name="index 1" w:semiHidden="1" w:unhideWhenUsed="1"/>
+    <w:lsdException w:name="index 2" w:semiHidden="1" w:unhideWhenUsed="1"/>
+    <w:lsdException w:name="index 3" w:semiHidden="1" w:unhideWhenUsed="1"/>
+    <w:lsdException w:name="index 4" w:semiHidden="1" w:unhideWhenUsed="1"/>
+    <w:lsdException w:name="index 5" w:semiHidden="1" w:unhideWhenUsed="1"/>
+    <w:lsdException w:name="index 6" w:semiHidden="1" w:unhideWhenUsed="1"/>
+    <w:lsdException w:name="index 7" w:semiHidden="1" w:unhideWhenUsed="1"/>
+    <w:lsdException w:name="index 8" w:semiHidden="1" w:unhideWhenUsed="1"/>
+    <w:lsdException w:name="index 9" w:semiHidden="1" w:unhideWhenUsed="1"/>
+    <w:lsdException w:name="toc 1" w:semiHidden="1" w:uiPriority="39" w:unhideWhenUsed="1"/>
+    <w:lsdException w:name="toc 2" w:semiHidden="1" w:uiPriority="39" w:unhideWhenUsed="1"/>
+    <w:lsdException w:name="toc 3" w:semiHidden="1" w:uiPriority="39" w:unhideWhenUsed="1"/>
+    <w:lsdException w:name="toc 4" w:semiHidden="1" w:uiPriority="39" w:unhideWhenUsed="1"/>
+    <w:lsdException w:name="toc 5" w:semiHidden="1" w:uiPriority="39" w:unhideWhenUsed="1"/>
+    <w:lsdException w:name="toc 6" w:semiHidden="1" w:uiPriority="39" w:unhideWhenUsed="1"/>
+    <w:lsdException w:name="toc 7" w:semiHidden="1" w:uiPriority="39" w:unhideWhenUsed="1"/>
+    <w:lsdException w:name="toc 8" w:semiHidden="1" w:uiPriority="39" w:unhideWhenUsed="1"/>
+    <w:lsdException w:name="toc 9" w:semiHidden="1" w:uiPriority="39" w:unhideWhenUsed="1"/>
+    <w:lsdException w:name="Normal Indent" w:semiHidden="1" w:unhideWhenUsed="1"/>
+    <w:lsdException w:name="footnote text" w:semiHidden="1" w:unhideWhenUsed="1"/>
+    <w:lsdException w:name="annotation text" w:semiHidden="1" w:unhideWhenUsed="1"/>
+    <w:lsdException w:name="header" w:semiHidden="1" w:unhideWhenUsed="1"/>
+    <w:lsdException w:name="footer" w:semiHidden="1" w:unhideWhenUsed="1"/>
+    <w:lsdException w:name="index heading" w:semiHidden="1" w:unhideWhenUsed="1"/>
+    <w:lsdException w:name="caption" w:semiHidden="1" w:uiPriority="35" w:unhideWhenUsed="1" w:qFormat="1"/>
+    <w:lsdException w:name="table of figures" w:semiHidden="1" w:unhideWhenUsed="1"/>
+    <w:lsdException w:name="envelope address" w:semiHidden="1" w:unhideWhenUsed="1"/>
+    <w:lsdException w:name="envelope return" w:semiHidden="1" w:unhideWhenUsed="1"/>
+    <w:lsdException w:name="footnote reference" w:semiHidden="1" w:unhideWhenUsed="1"/>
+    <w:lsdException w:name="annotation reference" w:semiHidden="1" w:unhideWhenUsed="1"/>
+    <w:lsdException w:name="line number" w:semiHidden="1" w:unhideWhenUsed="1"/>
+    <w:lsdException w:name="page number" w:semiHidden="1" w:unhideWhenUsed="1"/>
+    <w:lsdException w:name="endnote reference" w:semiHidden="1" w:unhideWhenUsed="1"/>
+    <w:lsdException w:name="endnote text" w:semiHidden="1" w:unhideWhenUsed="1"/>
+    <w:lsdException w:name="table of authorities" w:semiHidden="1" w:unhideWhenUsed="1"/>
+    <w:lsdException w:name="macro" w:semiHidden="1" w:unhideWhenUsed="1"/>
+    <w:lsdException w:name="toa heading" w:semiHidden="1" w:unhideWhenUsed="1"/>
+    <w:lsdException w:name="List" w:semiHidden="1" w:unhideWhenUsed="1"/>
+    <w:lsdException w:name="List Bullet" w:semiHidden="1" w:unhideWhenUsed="1"/>
+    <w:lsdException w:name="List Number" w:semiHidden="1" w:unhideWhenUsed="1"/>
+    <w:lsdException w:name="List 2" w:semiHidden="1" w:unhideWhenUsed="1"/>
+    <w:lsdException w:name="List 3" w:semiHidden="1" w:unhideWhenUsed="1"/>
+    <w:lsdException w:name="List 4" w:semiHidden="1" w:unhideWhenUsed="1"/>
+    <w:lsdException w:name="List 5" w:semiHidden="1" w:unhideWhenUsed="1"/>
+    <w:lsdException w:name="List Bullet 2" w:semiHidden="1" w:unhideWhenUsed="1"/>
+    <w:lsdException w:name="List Bullet 3" w:semiHidden="1" w:unhideWhenUsed="1"/>
+    <w:lsdException w:name="List Bullet 4" w:semiHidden="1" w:unhideWhenUsed="1"/>
+    <w:lsdException w:name="List Bullet 5" w:semiHidden="1" w:unhideWhenUsed="1"/>
+    <w:lsdException w:name="List Number 2" w:semiHidden="1" w:unhideWhenUsed="1"/>
+    <w:lsdException w:name="List Number 3" w:semiHidden="1" w:unhideWhenUsed="1"/>
+    <w:lsdException w:name="List Number 4" w:semiHidden="1" w:unhideWhenUsed="1"/>
+    <w:lsdException w:name="List Number 5" w:semiHidden="1" w:unhideWhenUsed="1"/>
+    <w:lsdException w:name="Title" w:uiPriority="10" w:qFormat="1"/>
+    <w:lsdException w:name="Closing" w:semiHidden="1" w:unhideWhenUsed="1"/>
+    <w:lsdException w:name="Signature" w:semiHidden="1" w:unhideWhenUsed="1"/>
+    <w:lsdException w:name="Default Paragraph Font" w:semiHidden="1" w:uiPriority="1" w:unhideWhenUsed="1"/>
+    <w:lsdException w:name="Body Text" w:semiHidden="1" w:unhideWhenUsed="1"/>
+    <w:lsdException w:name="Body Text Indent" w:semiHidden="1" w:unhideWhenUsed="1"/>
+    <w:lsdException w:name="List Continue" w:semiHidden="1" w:unhideWhenUsed="1"/>
+    <w:lsdException w:name="List Continue 2" w:semiHidden="1" w:unhideWhenUsed="1"/>
+    <w:lsdException w:name="List Continue 3" w:semiHidden="1" w:unhideWhenUsed="1"/>
+    <w:lsdException w:name="List Continue 4" w:semiHidden="1" w:unhideWhenUsed="1"/>
+    <w:lsdException w:name="List Continue 5" w:semiHidden="1" w:unhideWhenUsed="1"/>
+    <w:lsdException w:name="Message Header" w:semiHidden="1" w:unhideWhenUsed="1"/>
+    <w:lsdException w:name="Subtitle" w:uiPriority="11" w:qFormat="1"/>
+    <w:lsdException w:name="Salutation" w:semiHidden="1" w:unhideWhenUsed="1"/>
+    <w:lsdException w:name="Date" w:semiHidden="1" w:unhideWhenUsed="1"/>
+    <w:lsdException w:name="Body Text First Indent" w:semiHidden="1" w:unhideWhenUsed="1"/>
+    <w:lsdException w:name="Body Text First Indent 2" w:semiHidden="1" w:unhideWhenUsed="1"/>
+    <w:lsdException w:name="Note Heading" w:semiHidden="1" w:unhideWhenUsed="1"/>
+    <w:lsdException w:name="Body Text 2" w:semiHidden="1" w:unhideWhenUsed="1"/>
+    <w:lsdException w:name="Body Text 3" w:semiHidden="1" w:unhideWhenUsed="1"/>
+    <w:lsdException w:name="Body Text Indent 2" w:semiHidden="1" w:unhideWhenUsed="1"/>
+    <w:lsdException w:name="Body Text Indent 3" w:semiHidden="1" w:unhideWhenUsed="1"/>
+    <w:lsdException w:name="Block Text" w:semiHidden="1" w:unhideWhenUsed="1"/>
+    <w:lsdException w:name="Hyperlink" w:semiHidden="1" w:unhideWhenUsed="1"/>
+    <w:lsdException w:name="FollowedHyperlink" w:semiHidden="1" w:unhideWhenUsed="1"/>
+    <w:lsdException w:name="Strong" w:uiPriority="22" w:qFormat="1"/>
+    <w:lsdException w:name="Emphasis" w:uiPriority="20" w:qFormat="1"/>
+    <w:lsdException w:name="Document Map" w:semiHidden="1" w:unhideWhenUsed="1"/>
+    <w:lsdException w:name="Plain Text" w:semiHidden="1" w:unhideWhenUsed="1"/>
+    <w:lsdException w:name="E-mail Signature" w:semiHidden="1" w:unhideWhenUsed="1"/>
+    <w:lsdException w:name="HTML Top of Form" w:semiHidden="1" w:unhideWhenUsed="1"/>
+    <w:lsdException w:name="HTML Bottom of Form" w:semiHidden="1" w:unhideWhenUsed="1"/>
+    <w:lsdException w:name="Normal (Web)" w:semiHidden="1" w:unhideWhenUsed="1"/>
+    <w:lsdException w:name="HTML Acronym" w:semiHidden="1" w:unhideWhenUsed="1"/>
+    <w:lsdException w:name="HTML Address" w:semiHidden="1" w:unhideWhenUsed="1"/>
+    <w:lsdException w:name="HTML Cite" w:semiHidden="1" w:unhideWhenUsed="1"/>
+    <w:lsdException w:name="HTML Code" w:semiHidden="1" w:unhideWhenUsed="1"/>
+    <w:lsdException w:name="HTML Definition" w:semiHidden="1" w:unhideWhenUsed="1"/>
+    <w:lsdException w:name="HTML Keyboard" w:semiHidden="1" w:unhideWhenUsed="1"/>
+    <w:lsdException w:name="HTML Preformatted" w:semiHidden="1" w:unhideWhenUsed="1"/>
+    <w:lsdException w:name="HTML Sample" w:semiHidden="1" w:unhideWhenUsed="1"/>
+    <w:lsdException w:name="HTML Typewriter" w:semiHidden="1" w:unhideWhenUsed="1"/>
+    <w:lsdException w:name="HTML Variable" w:semiHidden="1" w:unhideWhenUsed="1"/>
+    <w:lsdException w:name="Normal Table" w:semiHidden="1" w:unhideWhenUsed="1"/>
+    <w:lsdException w:name="annotation subject" w:semiHidden="1" w:unhideWhenUsed="1"/>
+    <w:lsdException w:name="No List" w:semiHidden="1" w:unhideWhenUsed="1"/>
+    <w:lsdException w:name="Outline List 1" w:semiHidden="1" w:unhideWhenUsed="1"/>
+    <w:lsdException w:name="Outline List 2" w:semiHidden="1" w:unhideWhenUsed="1"/>
+    <w:lsdException w:name="Outline List 3" w:semiHidden="1" w:unhideWhenUsed="1"/>
+    <w:lsdException w:name="Table Simple 1" w:semiHidden="1" w:unhideWhenUsed="1"/>
+    <w:lsdException w:name="Table Simple 2" w:semiHidden="1" w:unhideWhenUsed="1"/>
+    <w:lsdException w:name="Table Simple 3" w:semiHidden="1" w:unhideWhenUsed="1"/>
+    <w:lsdException w:name="Table Classic 1" w:semiHidden="1" w:unhideWhenUsed="1"/>
+    <w:lsdException w:name="Table Classic 2" w:semiHidden="1" w:unhideWhenUsed="1"/>
+    <w:lsdException w:name="Table Classic 3" w:semiHidden="1" w:unhideWhenUsed="1"/>
+    <w:lsdException w:name="Table Classic 4" w:semiHidden="1" w:unhideWhenUsed="1"/>
+    <w:lsdException w:name="Table Colorful 1" w:semiHidden="1" w:unhideWhenUsed="1"/>
+    <w:lsdException w:name="Table Colorful 2" w:semiHidden="1" w:unhideWhenUsed="1"/>
+    <w:lsdException w:name="Table Colorful 3" w:semiHidden="1" w:unhideWhenUsed="1"/>
+    <w:lsdException w:name="Table Columns 1" w:semiHidden="1" w:unhideWhenUsed="1"/>
+    <w:lsdException w:name="Table Columns 2" w:semiHidden="1" w:unhideWhenUsed="1"/>
+    <w:lsdException w:name="Table Columns 3" w:semiHidden="1" w:unhideWhenUsed="1"/>
+    <w:lsdException w:name="Table Columns 4" w:semiHidden="1" w:unhideWhenUsed="1"/>
+    <w:lsdException w:name="Table Columns 5" w:semiHidden="1" w:unhideWhenUsed="1"/>
+    <w:lsdException w:name="Table Grid 1" w:semiHidden="1" w:unhideWhenUsed="1"/>
+    <w:lsdException w:name="Table Grid 2" w:semiHidden="1" w:unhideWhenUsed="1"/>
+    <w:lsdException w:name="Table Grid 3" w:semiHidden="1" w:unhideWhenUsed="1"/>
+    <w:lsdException w:name="Table Grid 4" w:semiHidden="1" w:unhideWhenUsed="1"/>
+    <w:lsdException w:name="Table Grid 5" w:semiHidden="1" w:unhideWhenUsed="1"/>
+    <w:lsdException w:name="Table Grid 6" w:semiHidden="1" w:unhideWhenUsed="1"/>
+    <w:lsdException w:name="Table Grid 7" w:semiHidden="1" w:unhideWhenUsed="1"/>
+    <w:lsdException w:name="Table Grid 8" w:semiHidden="1" w:unhideWhenUsed="1"/>
+    <w:lsdException w:name="Table List 1" w:semiHidden="1" w:unhideWhenUsed="1"/>
+    <w:lsdException w:name="Table List 2" w:semiHidden="1" w:unhideWhenUsed="1"/>
+    <w:lsdException w:name="Table List 3" w:semiHidden="1" w:unhideWhenUsed="1"/>
+    <w:lsdException w:name="Table List 4" w:semiHidden="1" w:unhideWhenUsed="1"/>
+    <w:lsdException w:name="Table List 5" w:semiHidden="1" w:unhideWhenUsed="1"/>
+    <w:lsdException w:name="Table List 6" w:semiHidden="1" w:unhideWhenUsed="1"/>
+    <w:lsdException w:name="Table List 7" w:semiHidden="1" w:unhideWhenUsed="1"/>
+    <w:lsdException w:name="Table List 8" w:semiHidden="1" w:unhideWhenUsed="1"/>
+    <w:lsdException w:name="Table 3D effects 1" w:semiHidden="1" w:unhideWhenUsed="1"/>
+    <w:lsdException w:name="Table 3D effects 2" w:semiHidden="1" w:unhideWhenUsed="1"/>
+    <w:lsdException w:name="Table 3D effects 3" w:semiHidden="1" w:unhideWhenUsed="1"/>
+    <w:lsdException w:name="Table Contemporary" w:semiHidden="1" w:unhideWhenUsed="1"/>
+    <w:lsdException w:name="Table Elegant" w:semiHidden="1" w:unhideWhenUsed="1"/>
+    <w:lsdException w:name="Table Professional" w:semiHidden="1" w:unhideWhenUsed="1"/>
+    <w:lsdException w:name="Table Subtle 1" w:semiHidden="1" w:unhideWhenUsed="1"/>
+    <w:lsdException w:name="Table Subtle 2" w:semiHidden="1" w:unhideWhenUsed="1"/>
+    <w:lsdException w:name="Table Web 1" w:semiHidden="1" w:unhideWhenUsed="1"/>
+    <w:lsdException w:name="Table Web 2" w:semiHidden="1" w:unhideWhenUsed="1"/>
+    <w:lsdException w:name="Table Web 3" w:semiHidden="1" w:unhideWhenUsed="1"/>
+    <w:lsdException w:name="Balloon Text" w:semiHidden="1" w:unhideWhenUsed="1"/>
+    <w:lsdException w:name="Table Grid" w:uiPriority="39"/>
+    <w:lsdException w:name="Table Theme" w:semiHidden="1" w:unhideWhenUsed="1"/>
+    <w:lsdException w:name="Placeholder Text" w:semiHidden="1"/>
+    <w:lsdException w:name="No Spacing" w:uiPriority="1" w:qFormat="1"/>
+    <w:lsdException w:name="Light Shading" w:uiPriority="60"/>
+    <w:lsdException w:name="Light List" w:uiPriority="61"/>
+    <w:lsdException w:name="Light Grid" w:uiPriority="62"/>
+    <w:lsdException w:name="Medium Shading 1" w:uiPriority="63"/>
+    <w:lsdException w:name="Medium Shading 2" w:uiPriority="64"/>
+    <w:lsdException w:name="Medium List 1" w:uiPriority="65"/>
+    <w:lsdException w:name="Medium List 2" w:uiPriority="66"/>
+    <w:lsdException w:name="Medium Grid 1" w:uiPriority="67"/>
+    <w:lsdException w:name="Medium Grid 2" w:uiPriority="68"/>
+    <w:lsdException w:name="Medium Grid 3" w:uiPriority="69"/>
+    <w:lsdException w:name="Dark List" w:uiPriority="70"/>
+    <w:lsdException w:name="Colorful Shading" w:uiPriority="71"/>
+    <w:lsdException w:name="Colorful List" w:uiPriority="72"/>
+    <w:lsdException w:name="Colorful Grid" w:uiPriority="73"/>
+    <w:lsdException w:name="Light Shading Accent 1" w:uiPriority="60"/>
+    <w:lsdException w:name="Light List Accent 1" w:uiPriority="61"/>
+    <w:lsdException w:name="Light Grid Accent 1" w:uiPriority="62"/>
+    <w:lsdException w:name="Medium Shading 1 Accent 1" w:uiPriority="63"/>
+    <w:lsdException w:name="Medium Shading 2 Accent 1" w:uiPriority="64"/>
+    <w:lsdException w:name="Medium List 1 Accent 1" w:uiPriority="65"/>
+    <w:lsdException w:name="Revision" w:semiHidden="1"/>
+    <w:lsdException w:name="List Paragraph" w:uiPriority="34" w:qFormat="1"/>
+    <w:lsdException w:name="Quote" w:uiPriority="29" w:qFormat="1"/>
+    <w:lsdException w:name="Intense Quote" w:uiPriority="30" w:qFormat="1"/>
+    <w:lsdException w:name="Medium List 2 Accent 1" w:uiPriority="66"/>
+    <w:lsdException w:name="Medium Grid 1 Accent 1" w:uiPriority="67"/>
+    <w:lsdException w:name="Medium Grid 2 Accent 1" w:uiPriority="68"/>
+    <w:lsdException w:name="Medium Grid 3 Accent 1" w:uiPriority="69"/>
+    <w:lsdException w:name="Dark List Accent 1" w:uiPriority="70"/>
+    <w:lsdException w:name="Colorful Shading Accent 1" w:uiPriority="71"/>
+    <w:lsdException w:name="Colorful List Accent 1" w:uiPriority="72"/>
+    <w:lsdException w:name="Colorful Grid Accent 1" w:uiPriority="73"/>
+    <w:lsdException w:name="Light Shading Accent 2" w:uiPriority="60"/>
+    <w:lsdException w:name="Light List Accent 2" w:uiPriority="61"/>
+    <w:lsdException w:name="Light Grid Accent 2" w:uiPriority="62"/>
+    <w:lsdException w:name="Medium Shading 1 Accent 2" w:uiPriority="63"/>
+    <w:lsdException w:name="Medium Shading 2 Accent 2" w:uiPriority="64"/>
+    <w:lsdException w:name="Medium List 1 Accent 2" w:uiPriority="65"/>
+    <w:lsdException w:name="Medium List 2 Accent 2" w:uiPriority="66"/>
+    <w:lsdException w:name="Medium Grid 1 Accent 2" w:uiPriority="67"/>
+    <w:lsdException w:name="Medium Grid 2 Accent 2" w:uiPriority="68"/>
+    <w:lsdException w:name="Medium Grid 3 Accent 2" w:uiPriority="69"/>
+    <w:lsdException w:name="Dark List Accent 2" w:uiPriority="70"/>
+    <w:lsdException w:name="Colorful Shading Accent 2" w:uiPriority="71"/>
+    <w:lsdException w:name="Colorful List Accent 2" w:uiPriority="72"/>
+    <w:lsdException w:name="Colorful Grid Accent 2" w:uiPriority="73"/>
+    <w:lsdException w:name="Light Shading Accent 3" w:uiPriority="60"/>
+    <w:lsdException w:name="Light List Accent 3" w:uiPriority="61"/>
+    <w:lsdException w:name="Light Grid Accent 3" w:uiPriority="62"/>
+    <w:lsdException w:name="Medium Shading 1 Accent 3" w:uiPriority="63"/>
+    <w:lsdException w:name="Medium Shading 2 Accent 3" w:uiPriority="64"/>
+    <w:lsdException w:name="Medium List 1 Accent 3" w:uiPriority="65"/>
+    <w:lsdException w:name="Medium List 2 Accent 3" w:uiPriority="66"/>
+    <w:lsdException w:name="Medium Grid 1 Accent 3" w:uiPriority="67"/>
+    <w:lsdException w:name="Medium Grid 2 Accent 3" w:uiPriority="68"/>
+    <w:lsdException w:name="Medium Grid 3 Accent 3" w:uiPriority="69"/>
+    <w:lsdException w:name="Dark List Accent 3" w:uiPriority="70"/>
+    <w:lsdException w:name="Colorful Shading Accent 3" w:uiPriority="71"/>
+    <w:lsdException w:name="Colorful List Accent 3" w:uiPriority="72"/>
+    <w:lsdException w:name="Colorful Grid Accent 3" w:uiPriority="73"/>
+    <w:lsdException w:name="Light Shading Accent 4" w:uiPriority="60"/>
+    <w:lsdException w:name="Light List Accent 4" w:uiPriority="61"/>
+    <w:lsdException w:name="Light Grid Accent 4" w:uiPriority="62"/>
+    <w:lsdException w:name="Medium Shading 1 Accent 4" w:uiPriority="63"/>
+    <w:lsdException w:name="Medium Shading 2 Accent 4" w:uiPriority="64"/>
+    <w:lsdException w:name="Medium List 1 Accent 4" w:uiPriority="65"/>
+    <w:lsdException w:name="Medium List 2 Accent 4" w:uiPriority="66"/>
+    <w:lsdException w:name="Medium Grid 1 Accent 4" w:uiPriority="67"/>
+    <w:lsdException w:name="Medium Grid 2 Accent 4" w:uiPriority="68"/>
+    <w:lsdException w:name="Medium Grid 3 Accent 4" w:uiPriority="69"/>
+    <w:lsdException w:name="Dark List Accent 4" w:uiPriority="70"/>
+    <w:lsdException w:name="Colorful Shading Accent 4" w:uiPriority="71"/>
+    <w:lsdException w:name="Colorful List Accent 4" w:uiPriority="72"/>
+    <w:lsdException w:name="Colorful Grid Accent 4" w:uiPriority="73"/>
+    <w:lsdException w:name="Light Shading Accent 5" w:uiPriority="60"/>
+    <w:lsdException w:name="Light List Accent 5" w:uiPriority="61"/>
+    <w:lsdException w:name="Light Grid Accent 5" w:uiPriority="62"/>
+    <w:lsdException w:name="Medium Shading 1 Accent 5" w:uiPriority="63"/>
+    <w:lsdException w:name="Medium Shading 2 Accent 5" w:uiPriority="64"/>
+    <w:lsdException w:name="Medium List 1 Accent 5" w:uiPriority="65"/>
+    <w:lsdException w:name="Medium List 2 Accent 5" w:uiPriority="66"/>
+    <w:lsdException w:name="Medium Grid 1 Accent 5" w:uiPriority="67"/>
+    <w:lsdException w:name="Medium Grid 2 Accent 5" w:uiPriority="68"/>
+    <w:lsdException w:name="Medium Grid 3 Accent 5" w:uiPriority="69"/>
+    <w:lsdException w:name="Dark List Accent 5" w:uiPriority="70"/>
+    <w:lsdException w:name="Colorful Shading Accent 5" w:uiPriority="71"/>
+    <w:lsdException w:name="Colorful List Accent 5" w:uiPriority="72"/>
+    <w:lsdException w:name="Colorful Grid Accent 5" w:uiPriority="73"/>
+    <w:lsdException w:name="Light Shading Accent 6" w:uiPriority="60"/>
+    <w:lsdException w:name="Light List Accent 6" w:uiPriority="61"/>
+    <w:lsdException w:name="Light Grid Accent 6" w:uiPriority="62"/>
+    <w:lsdException w:name="Medium Shading 1 Accent 6" w:uiPriority="63"/>
+    <w:lsdException w:name="Medium Shading 2 Accent 6" w:uiPriority="64"/>
+    <w:lsdException w:name="Medium List 1 Accent 6" w:uiPriority="65"/>
+    <w:lsdException w:name="Medium List 2 Accent 6" w:uiPriority="66"/>
+    <w:lsdException w:name="Medium Grid 1 Accent 6" w:uiPriority="67"/>
+    <w:lsdException w:name="Medium Grid 2 Accent 6" w:uiPriority="68"/>
+    <w:lsdException w:name="Medium Grid 3 Accent 6" w:uiPriority="69"/>
+    <w:lsdException w:name="Dark List Accent 6" w:uiPriority="70"/>
+    <w:lsdException w:name="Colorful Shading Accent 6" w:uiPriority="71"/>
+    <w:lsdException w:name="Colorful List Accent 6" w:uiPriority="72"/>
+    <w:lsdException w:name="Colorful Grid Accent 6" w:uiPriority="73"/>
+    <w:lsdException w:name="Subtle Emphasis" w:uiPriority="19" w:qFormat="1"/>
+    <w:lsdException w:name="Intense Emphasis" w:uiPriority="21" w:qFormat="1"/>
+    <w:lsdException w:name="Subtle Reference" w:uiPriority="31" w:qFormat="1"/>
+    <w:lsdException w:name="Intense Reference" w:uiPriority="32" w:qFormat="1"/>
+    <w:lsdException w:name="Book Title" w:uiPriority="33" w:qFormat="1"/>
+    <w:lsdException w:name="Bibliography" w:semiHidden="1" w:uiPriority="37" w:unhideWhenUsed="1"/>
+    <w:lsdException w:name="TOC Heading" w:semiHidden="1" w:uiPriority="39" w:unhideWhenUsed="1" w:qFormat="1"/>
+    <w:lsdException w:name="Plain Table 1" w:uiPriority="41"/>
+    <w:lsdException w:name="Plain Table 2" w:uiPriority="42"/>
+    <w:lsdException w:name="Plain Table 3" w:uiPriority="43"/>
+    <w:lsdException w:name="Plain Table 4" w:uiPriority="44"/>
+    <w:lsdException w:name="Plain Table 5" w:uiPriority="45"/>
+    <w:lsdException w:name="Grid Table Light" w:uiPriority="40"/>
+    <w:lsdException w:name="Grid Table 1 Light" w:uiPriority="46"/>
+    <w:lsdException w:name="Grid Table 2" w:uiPriority="47"/>
+    <w:lsdException w:name="Grid Table 3" w:uiPriority="48"/>
+    <w:lsdException w:name="Grid Table 4" w:uiPriority="49"/>
+    <w:lsdException w:name="Grid Table 5 Dark" w:uiPriority="50"/>
+    <w:lsdException w:name="Grid Table 6 Colorful" w:uiPriority="51"/>
+    <w:lsdException w:name="Grid Table 7 Colorful" w:uiPriority="52"/>
+    <w:lsdException w:name="Grid Table 1 Light Accent 1" w:uiPriority="46"/>
+    <w:lsdException w:name="Grid Table 2 Accent 1" w:uiPriority="47"/>
+    <w:lsdException w:name="Grid Table 3 Accent 1" w:uiPriority="48"/>
+    <w:lsdException w:name="Grid Table 4 Accent 1" w:uiPriority="49"/>
+    <w:lsdException w:name="Grid Table 5 Dark Accent 1" w:uiPriority="50"/>
+    <w:lsdException w:name="Grid Table 6 Colorful Accent 1" w:uiPriority="51"/>
+    <w:lsdException w:name="Grid Table 7 Colorful Accent 1" w:uiPriority="52"/>
+    <w:lsdException w:name="Grid Table 1 Light Accent 2" w:uiPriority="46"/>
+    <w:lsdException w:name="Grid Table 2 Accent 2" w:uiPriority="47"/>
+    <w:lsdException w:name="Grid Table 3 Accent 2" w:uiPriority="48"/>
+    <w:lsdException w:name="Grid Table 4 Accent 2" w:uiPriority="49"/>
+    <w:lsdException w:name="Grid Table 5 Dark Accent 2" w:uiPriority="50"/>
+    <w:lsdException w:name="Grid Table 6 Colorful Accent 2" w:uiPriority="51"/>
+    <w:lsdException w:name="Grid Table 7 Colorful Accent 2" w:uiPriority="52"/>
+    <w:lsdException w:name="Grid Table 1 Light Accent 3" w:uiPriority="46"/>
+    <w:lsdException w:name="Grid Table 2 Accent 3" w:uiPriority="47"/>
+    <w:lsdException w:name="Grid Table 3 Accent 3" w:uiPriority="48"/>
+    <w:lsdException w:name="Grid Table 4 Accent 3" w:uiPriority="49"/>
+    <w:lsdException w:name="Grid Table 5 Dark Accent 3" w:uiPriority="50"/>
+    <w:lsdException w:name="Grid Table 6 Colorful Accent 3" w:uiPriority="51"/>
+    <w:lsdException w:name="Grid Table 7 Colorful Accent 3" w:uiPriority="52"/>
+    <w:lsdException w:name="Grid Table 1 Light Accent 4" w:uiPriority="46"/>
+    <w:lsdException w:name="Grid Table 2 Accent 4" w:uiPriority="47"/>
+    <w:lsdException w:name="Grid Table 3 Accent 4" w:uiPriority="48"/>
+    <w:lsdException w:name="Grid Table 4 Accent 4" w:uiPriority="49"/>
+    <w:lsdException w:name="Grid Table 5 Dark Accent 4" w:uiPriority="50"/>
+    <w:lsdException w:name="Grid Table 6 Colorful Accent 4" w:uiPriority="51"/>
+    <w:lsdException w:name="Grid Table 7 Colorful Accent 4" w:uiPriority="52"/>
+    <w:lsdException w:name="Grid Table 1 Light Accent 5" w:uiPriority="46"/>
+    <w:lsdException w:name="Grid Table 2 Accent 5" w:uiPriority="47"/>
+    <w:lsdException w:name="Grid Table 3 Accent 5" w:uiPriority="48"/>
+    <w:lsdException w:name="Grid Table 4 Accent 5" w:uiPriority="49"/>
+    <w:lsdException w:name="Grid Table 5 Dark Accent 5" w:uiPriority="50"/>
+    <w:lsdException w:name="Grid Table 6 Colorful Accent 5" w:uiPriority="51"/>
+    <w:lsdException w:name="Grid Table 7 Colorful Accent 5" w:uiPriority="52"/>
+    <w:lsdException w:name="Grid Table 1 Light Accent 6" w:uiPriority="46"/>
+    <w:lsdException w:name="Grid Table 2 Accent 6" w:uiPriority="47"/>
+    <w:lsdException w:name="Grid Table 3 Accent 6" w:uiPriority="48"/>
+    <w:lsdException w:name="Grid Table 4 Accent 6" w:uiPriority="49"/>
+    <w:lsdException w:name="Grid Table 5 Dark Accent 6" w:uiPriority="50"/>
+    <w:lsdException w:name="Grid Table 6 Colorful Accent 6" w:uiPriority="51"/>
+    <w:lsdException w:name="Grid Table 7 Colorful Accent 6" w:uiPriority="52"/>
+    <w:lsdException w:name="List Table 1 Light" w:uiPriority="46"/>
+    <w:lsdException w:name="List Table 2" w:uiPriority="47"/>
+    <w:lsdException w:name="List Table 3" w:uiPriority="48"/>
+    <w:lsdException w:name="List Table 4" w:uiPriority="49"/>
+    <w:lsdException w:name="List Table 5 Dark" w:uiPriority="50"/>
+    <w:lsdException w:name="List Table 6 Colorful" w:uiPriority="51"/>
+    <w:lsdException w:name="List Table 7 Colorful" w:uiPriority="52"/>
+    <w:lsdException w:name="List Table 1 Light Accent 1" w:uiPriority="46"/>
+    <w:lsdException w:name="List Table 2 Accent 1" w:uiPriority="47"/>
+    <w:lsdException w:name="List Table 3 Accent 1" w:uiPriority="48"/>
+    <w:lsdException w:name="List Table 4 Accent 1" w:uiPriority="49"/>
+    <w:lsdException w:name="List Table 5 Dark Accent 1" w:uiPriority="50"/>
+    <w:lsdException w:name="List Table 6 Colorful Accent 1" w:uiPriority="51"/>
+    <w:lsdException w:name="List Table 7 Colorful Accent 1" w:uiPriority="52"/>
+    <w:lsdException w:name="List Table 1 Light Accent 2" w:uiPriority="46"/>
+    <w:lsdException w:name="List Table 2 Accent 2" w:uiPriority="47"/>
+    <w:lsdException w:name="List Table 3 Accent 2" w:uiPriority="48"/>
+    <w:lsdException w:name="List Table 4 Accent 2" w:uiPriority="49"/>
+    <w:lsdException w:name="List Table 5 Dark Accent 2" w:uiPriority="50"/>
+    <w:lsdException w:name="List Table 6 Colorful Accent 2" w:uiPriority="51"/>
+    <w:lsdException w:name="List Table 7 Colorful Accent 2" w:uiPriority="52"/>
+    <w:lsdException w:name="List Table 1 Light Accent 3" w:uiPriority="46"/>
+    <w:lsdException w:name="List Table 2 Accent 3" w:uiPriority="47"/>
+    <w:lsdException w:name="List Table 3 Accent 3" w:uiPriority="48"/>
+    <w:lsdException w:name="List Table 4 Accent 3" w:uiPriority="49"/>
+    <w:lsdException w:name="List Table 5 Dark Accent 3" w:uiPriority="50"/>
+    <w:lsdException w:name="List Table 6 Colorful Accent 3" w:uiPriority="51"/>
+    <w:lsdException w:name="List Table 7 Colorful Accent 3" w:uiPriority="52"/>
+    <w:lsdException w:name="List Table 1 Light Accent 4" w:uiPriority="46"/>
+    <w:lsdException w:name="List Table 2 Accent 4" w:uiPriority="47"/>
+    <w:lsdException w:name="List Table 3 Accent 4" w:uiPriority="48"/>
+    <w:lsdException w:name="List Table 4 Accent 4" w:uiPriority="49"/>
+    <w:lsdException w:name="List Table 5 Dark Accent 4" w:uiPriority="50"/>
+    <w:lsdException w:name="List Table 6 Colorful Accent 4" w:uiPriority="51"/>
+    <w:lsdException w:name="List Table 7 Colorful Accent 4" w:uiPriority="52"/>
+    <w:lsdException w:name="List Table 1 Light Accent 5" w:uiPriority="46"/>
+    <w:lsdException w:name="List Table 2 Accent 5" w:uiPriority="47"/>
+    <w:lsdException w:name="List Table 3 Accent 5" w:uiPriority="48"/>
+    <w:lsdException w:name="List Table 4 Accent 5" w:uiPriority="49"/>
+    <w:lsdException w:name="List Table 5 Dark Accent 5" w:uiPriority="50"/>
+    <w:lsdException w:name="List Table 6 Colorful Accent 5" w:uiPriority="51"/>
+    <w:lsdException w:name="List Table 7 Colorful Accent 5" w:uiPriority="52"/>
+    <w:lsdException w:name="List Table 1 Light Accent 6" w:uiPriority="46"/>
+    <w:lsdException w:name="List Table 2 Accent 6" w:uiPriority="47"/>
+    <w:lsdException w:name="List Table 3 Accent 6" w:uiPriority="48"/>
+    <w:lsdException w:name="List Table 4 Accent 6" w:uiPriority="49"/>
+    <w:lsdException w:name="List Table 5 Dark Accent 6" w:uiPriority="50"/>
+    <w:lsdException w:name="List Table 6 Colorful Accent 6" w:uiPriority="51"/>
+    <w:lsdException w:name="List Table 7 Colorful Accent 6" w:uiPriority="52"/>
+    <w:lsdException w:name="Mention" w:semiHidden="1" w:unhideWhenUsed="1"/>
+    <w:lsdException w:name="Smart Hyperlink" w:semiHidden="1" w:unhideWhenUsed="1"/>
+    <w:lsdException w:name="Hashtag" w:semiHidden="1" w:unhideWhenUsed="1"/>
+    <w:lsdException w:name="Unresolved Mention" w:semiHidden="1" w:unhideWhenUsed="1"/>
+    <w:lsdException w:name="Smart Link" w:semiHidden="1" w:unhideWhenUsed="1"/>
+  </w:latentStyles>
+  <w:style w:type="paragraph" w:default="1" w:styleId="Normal">
+    <w:name w:val="Normal"/>
     <w:qFormat/>
-    <w:rPr>
-      <w:sz w:val="56"/>
-      <w:szCs w:val="56"/>
-    </w:rPr>
   </w:style>
   <w:style w:type="paragraph" w:styleId="Heading1">
-    <w:name w:val="Heading 1"/>
-    <w:basedOn w:val="Normal"/>
-    <w:next w:val="Normal"/>
+    <w:name w:val="heading 1"/>
+    <w:uiPriority w:val="9"/>
     <w:qFormat/>
+    <w:pPr>
+      <w:outlineLvl w:val="0"/>
+    </w:pPr>
     <w:rPr>
       <w:color w:val="2E74B5"/>
       <w:sz w:val="32"/>
@@ -1657,10 +2113,13 @@
     </w:rPr>
   </w:style>
   <w:style w:type="paragraph" w:styleId="Heading2">
-    <w:name w:val="Heading 2"/>
-    <w:basedOn w:val="Normal"/>
-    <w:next w:val="Normal"/>
+    <w:name w:val="heading 2"/>
+    <w:uiPriority w:val="9"/>
+    <w:unhideWhenUsed/>
     <w:qFormat/>
+    <w:pPr>
+      <w:outlineLvl w:val="1"/>
+    </w:pPr>
     <w:rPr>
       <w:color w:val="2E74B5"/>
       <w:sz w:val="26"/>
@@ -1668,10 +2127,14 @@
     </w:rPr>
   </w:style>
   <w:style w:type="paragraph" w:styleId="Heading3">
-    <w:name w:val="Heading 3"/>
-    <w:basedOn w:val="Normal"/>
-    <w:next w:val="Normal"/>
+    <w:name w:val="heading 3"/>
+    <w:uiPriority w:val="9"/>
+    <w:semiHidden/>
+    <w:unhideWhenUsed/>
     <w:qFormat/>
+    <w:pPr>
+      <w:outlineLvl w:val="2"/>
+    </w:pPr>
     <w:rPr>
       <w:color w:val="1F4D78"/>
       <w:sz w:val="24"/>
@@ -1679,10 +2142,14 @@
     </w:rPr>
   </w:style>
   <w:style w:type="paragraph" w:styleId="Heading4">
-    <w:name w:val="Heading 4"/>
-    <w:basedOn w:val="Normal"/>
-    <w:next w:val="Normal"/>
+    <w:name w:val="heading 4"/>
+    <w:uiPriority w:val="9"/>
+    <w:semiHidden/>
+    <w:unhideWhenUsed/>
     <w:qFormat/>
+    <w:pPr>
+      <w:outlineLvl w:val="3"/>
+    </w:pPr>
     <w:rPr>
       <w:i/>
       <w:iCs/>
@@ -1690,27 +2157,69 @@
     </w:rPr>
   </w:style>
   <w:style w:type="paragraph" w:styleId="Heading5">
-    <w:name w:val="Heading 5"/>
-    <w:basedOn w:val="Normal"/>
-    <w:next w:val="Normal"/>
+    <w:name w:val="heading 5"/>
+    <w:uiPriority w:val="9"/>
+    <w:semiHidden/>
+    <w:unhideWhenUsed/>
     <w:qFormat/>
+    <w:pPr>
+      <w:outlineLvl w:val="4"/>
+    </w:pPr>
     <w:rPr>
       <w:color w:val="2E74B5"/>
     </w:rPr>
   </w:style>
   <w:style w:type="paragraph" w:styleId="Heading6">
-    <w:name w:val="Heading 6"/>
-    <w:basedOn w:val="Normal"/>
-    <w:next w:val="Normal"/>
+    <w:name w:val="heading 6"/>
+    <w:uiPriority w:val="9"/>
+    <w:semiHidden/>
+    <w:unhideWhenUsed/>
     <w:qFormat/>
+    <w:pPr>
+      <w:outlineLvl w:val="5"/>
+    </w:pPr>
     <w:rPr>
       <w:color w:val="1F4D78"/>
     </w:rPr>
   </w:style>
-  <w:style w:type="paragraph" w:styleId="Strong">
-    <w:name w:val="Strong"/>
-    <w:basedOn w:val="Normal"/>
-    <w:next w:val="Normal"/>
+  <w:style w:type="character" w:default="1" w:styleId="DefaultParagraphFont">
+    <w:name w:val="Default Paragraph Font"/>
+    <w:uiPriority w:val="1"/>
+    <w:semiHidden/>
+    <w:unhideWhenUsed/>
+  </w:style>
+  <w:style w:type="table" w:default="1" w:styleId="TableNormal">
+    <w:name w:val="Normal Table"/>
+    <w:uiPriority w:val="99"/>
+    <w:semiHidden/>
+    <w:unhideWhenUsed/>
+    <w:tblPr>
+      <w:tblInd w:w="0" w:type="dxa"/>
+      <w:tblCellMar>
+        <w:top w:w="0" w:type="dxa"/>
+        <w:left w:w="108" w:type="dxa"/>
+        <w:bottom w:w="0" w:type="dxa"/>
+        <w:right w:w="108" w:type="dxa"/>
+      </w:tblCellMar>
+    </w:tblPr>
+  </w:style>
+  <w:style w:type="numbering" w:default="1" w:styleId="NoList">
+    <w:name w:val="No List"/>
+    <w:uiPriority w:val="99"/>
+    <w:semiHidden/>
+    <w:unhideWhenUsed/>
+  </w:style>
+  <w:style w:type="paragraph" w:styleId="Title">
+    <w:name w:val="Title"/>
+    <w:uiPriority w:val="10"/>
+    <w:qFormat/>
+    <w:rPr>
+      <w:sz w:val="56"/>
+      <w:szCs w:val="56"/>
+    </w:rPr>
+  </w:style>
+  <w:style w:type="paragraph" w:customStyle="1" w:styleId="Strong1">
+    <w:name w:val="Strong1"/>
     <w:qFormat/>
     <w:rPr>
       <w:b/>
@@ -1719,12 +2228,10 @@
   </w:style>
   <w:style w:type="paragraph" w:styleId="ListParagraph">
     <w:name w:val="List Paragraph"/>
-    <w:basedOn w:val="Normal"/>
     <w:qFormat/>
   </w:style>
   <w:style w:type="character" w:styleId="Hyperlink">
     <w:name w:val="Hyperlink"/>
-    <w:basedOn w:val="DefaultParagraphFont"/>
     <w:uiPriority w:val="99"/>
     <w:unhideWhenUsed/>
     <w:rPr>
@@ -1734,7 +2241,6 @@
   </w:style>
   <w:style w:type="character" w:styleId="FootnoteReference">
     <w:name w:val="footnote reference"/>
-    <w:basedOn w:val="DefaultParagraphFont"/>
     <w:uiPriority w:val="99"/>
     <w:semiHidden/>
     <w:unhideWhenUsed/>
@@ -1744,22 +2250,17 @@
   </w:style>
   <w:style w:type="paragraph" w:styleId="FootnoteText">
     <w:name w:val="footnote text"/>
-    <w:basedOn w:val="Normal"/>
     <w:link w:val="FootnoteTextChar"/>
     <w:uiPriority w:val="99"/>
     <w:semiHidden/>
     <w:unhideWhenUsed/>
-    <w:pPr>
-      <w:spacing w:after="0" w:line="240" w:lineRule="auto"/>
-    </w:pPr>
     <w:rPr>
       <w:sz w:val="20"/>
       <w:szCs w:val="20"/>
     </w:rPr>
   </w:style>
-  <w:style w:type="character" w:styleId="FootnoteTextChar">
+  <w:style w:type="character" w:customStyle="1" w:styleId="FootnoteTextChar">
     <w:name w:val="Footnote Text Char"/>
-    <w:basedOn w:val="DefaultParagraphFont"/>
     <w:link w:val="FootnoteText"/>
     <w:uiPriority w:val="99"/>
     <w:semiHidden/>
@@ -1771,7 +2272,6 @@
   </w:style>
   <w:style w:type="character" w:styleId="EndnoteReference">
     <w:name w:val="endnote reference"/>
-    <w:basedOn w:val="DefaultParagraphFont"/>
     <w:uiPriority w:val="99"/>
     <w:semiHidden/>
     <w:unhideWhenUsed/>
@@ -1781,22 +2281,17 @@
   </w:style>
   <w:style w:type="paragraph" w:styleId="EndnoteText">
     <w:name w:val="endnote text"/>
-    <w:basedOn w:val="Normal"/>
     <w:link w:val="EndnoteTextChar"/>
     <w:uiPriority w:val="99"/>
     <w:semiHidden/>
     <w:unhideWhenUsed/>
-    <w:pPr>
-      <w:spacing w:after="0" w:line="240" w:lineRule="auto"/>
-    </w:pPr>
     <w:rPr>
       <w:sz w:val="20"/>
       <w:szCs w:val="20"/>
     </w:rPr>
   </w:style>
-  <w:style w:type="character" w:styleId="EndnoteTextChar">
+  <w:style w:type="character" w:customStyle="1" w:styleId="EndnoteTextChar">
     <w:name w:val="Endnote Text Char"/>
-    <w:basedOn w:val="DefaultParagraphFont"/>
     <w:link w:val="EndnoteText"/>
     <w:uiPriority w:val="99"/>
     <w:semiHidden/>
@@ -1807,4 +2302,319 @@
     </w:rPr>
   </w:style>
 </w:styles>
+</file>
+
+<file path=word/theme/theme1.xml><?xml version="1.0" encoding="utf-8"?>
+<a:theme xmlns:a="http://schemas.openxmlformats.org/drawingml/2006/main" name="Office Theme">
+  <a:themeElements>
+    <a:clrScheme name="Office">
+      <a:dk1>
+        <a:sysClr val="windowText" lastClr="FFFFFF"/>
+      </a:dk1>
+      <a:lt1>
+        <a:sysClr val="window" lastClr="000000"/>
+      </a:lt1>
+      <a:dk2>
+        <a:srgbClr val="0E2841"/>
+      </a:dk2>
+      <a:lt2>
+        <a:srgbClr val="E8E8E8"/>
+      </a:lt2>
+      <a:accent1>
+        <a:srgbClr val="156082"/>
+      </a:accent1>
+      <a:accent2>
+        <a:srgbClr val="E97132"/>
+      </a:accent2>
+      <a:accent3>
+        <a:srgbClr val="196B24"/>
+      </a:accent3>
+      <a:accent4>
+        <a:srgbClr val="0F9ED5"/>
+      </a:accent4>
+      <a:accent5>
+        <a:srgbClr val="A02B93"/>
+      </a:accent5>
+      <a:accent6>
+        <a:srgbClr val="4EA72E"/>
+      </a:accent6>
+      <a:hlink>
+        <a:srgbClr val="467886"/>
+      </a:hlink>
+      <a:folHlink>
+        <a:srgbClr val="96607D"/>
+      </a:folHlink>
+    </a:clrScheme>
+    <a:fontScheme name="Office">
+      <a:majorFont>
+        <a:latin typeface="Aptos Display" panose="02110004020202020204"/>
+        <a:ea typeface=""/>
+        <a:cs typeface=""/>
+        <a:font script="Jpan" typeface="游ゴシック Light"/>
+        <a:font script="Hang" typeface="맑은 고딕"/>
+        <a:font script="Hans" typeface="等线 Light"/>
+        <a:font script="Hant" typeface="新細明體"/>
+        <a:font script="Arab" typeface="Times New Roman"/>
+        <a:font script="Hebr" typeface="Times New Roman"/>
+        <a:font script="Thai" typeface="Angsana New"/>
+        <a:font script="Ethi" typeface="Nyala"/>
+        <a:font script="Beng" typeface="Vrinda"/>
+        <a:font script="Gujr" typeface="Shruti"/>
+        <a:font script="Khmr" typeface="MoolBoran"/>
+        <a:font script="Knda" typeface="Tunga"/>
+        <a:font script="Guru" typeface="Raavi"/>
+        <a:font script="Cans" typeface="Euphemia"/>
+        <a:font script="Cher" typeface="Plantagenet Cherokee"/>
+        <a:font script="Yiii" typeface="Microsoft Yi Baiti"/>
+        <a:font script="Tibt" typeface="Microsoft Himalaya"/>
+        <a:font script="Thaa" typeface="MV Boli"/>
+        <a:font script="Deva" typeface="Mangal"/>
+        <a:font script="Telu" typeface="Gautami"/>
+        <a:font script="Taml" typeface="Latha"/>
+        <a:font script="Syrc" typeface="Estrangelo Edessa"/>
+        <a:font script="Orya" typeface="Kalinga"/>
+        <a:font script="Mlym" typeface="Kartika"/>
+        <a:font script="Laoo" typeface="DokChampa"/>
+        <a:font script="Sinh" typeface="Iskoola Pota"/>
+        <a:font script="Mong" typeface="Mongolian Baiti"/>
+        <a:font script="Viet" typeface="Times New Roman"/>
+        <a:font script="Uigh" typeface="Microsoft Uighur"/>
+        <a:font script="Geor" typeface="Sylfaen"/>
+        <a:font script="Armn" typeface="Arial"/>
+        <a:font script="Bugi" typeface="Leelawadee UI"/>
+        <a:font script="Bopo" typeface="Microsoft JhengHei"/>
+        <a:font script="Java" typeface="Javanese Text"/>
+        <a:font script="Lisu" typeface="Segoe UI"/>
+        <a:font script="Mymr" typeface="Myanmar Text"/>
+        <a:font script="Nkoo" typeface="Ebrima"/>
+        <a:font script="Olck" typeface="Nirmala UI"/>
+        <a:font script="Osma" typeface="Ebrima"/>
+        <a:font script="Phag" typeface="Phagspa"/>
+        <a:font script="Syrn" typeface="Estrangelo Edessa"/>
+        <a:font script="Syrj" typeface="Estrangelo Edessa"/>
+        <a:font script="Syre" typeface="Estrangelo Edessa"/>
+        <a:font script="Sora" typeface="Nirmala UI"/>
+        <a:font script="Tale" typeface="Microsoft Tai Le"/>
+        <a:font script="Talu" typeface="Microsoft New Tai Lue"/>
+        <a:font script="Tfng" typeface="Ebrima"/>
+      </a:majorFont>
+      <a:minorFont>
+        <a:latin typeface="Aptos" panose="02110004020202020204"/>
+        <a:ea typeface=""/>
+        <a:cs typeface=""/>
+        <a:font script="Jpan" typeface="游明朝"/>
+        <a:font script="Hang" typeface="맑은 고딕"/>
+        <a:font script="Hans" typeface="等线"/>
+        <a:font script="Hant" typeface="新細明體"/>
+        <a:font script="Arab" typeface="Arial"/>
+        <a:font script="Hebr" typeface="Arial"/>
+        <a:font script="Thai" typeface="Cordia New"/>
+        <a:font script="Ethi" typeface="Nyala"/>
+        <a:font script="Beng" typeface="Vrinda"/>
+        <a:font script="Gujr" typeface="Shruti"/>
+        <a:font script="Khmr" typeface="DaunPenh"/>
+        <a:font script="Knda" typeface="Tunga"/>
+        <a:font script="Guru" typeface="Raavi"/>
+        <a:font script="Cans" typeface="Euphemia"/>
+        <a:font script="Cher" typeface="Plantagenet Cherokee"/>
+        <a:font script="Yiii" typeface="Microsoft Yi Baiti"/>
+        <a:font script="Tibt" typeface="Microsoft Himalaya"/>
+        <a:font script="Thaa" typeface="MV Boli"/>
+        <a:font script="Deva" typeface="Mangal"/>
+        <a:font script="Telu" typeface="Gautami"/>
+        <a:font script="Taml" typeface="Latha"/>
+        <a:font script="Syrc" typeface="Estrangelo Edessa"/>
+        <a:font script="Orya" typeface="Kalinga"/>
+        <a:font script="Mlym" typeface="Kartika"/>
+        <a:font script="Laoo" typeface="DokChampa"/>
+        <a:font script="Sinh" typeface="Iskoola Pota"/>
+        <a:font script="Mong" typeface="Mongolian Baiti"/>
+        <a:font script="Viet" typeface="Arial"/>
+        <a:font script="Uigh" typeface="Microsoft Uighur"/>
+        <a:font script="Geor" typeface="Sylfaen"/>
+        <a:font script="Armn" typeface="Arial"/>
+        <a:font script="Bugi" typeface="Leelawadee UI"/>
+        <a:font script="Bopo" typeface="Microsoft JhengHei"/>
+        <a:font script="Java" typeface="Javanese Text"/>
+        <a:font script="Lisu" typeface="Segoe UI"/>
+        <a:font script="Mymr" typeface="Myanmar Text"/>
+        <a:font script="Nkoo" typeface="Ebrima"/>
+        <a:font script="Olck" typeface="Nirmala UI"/>
+        <a:font script="Osma" typeface="Ebrima"/>
+        <a:font script="Phag" typeface="Phagspa"/>
+        <a:font script="Syrn" typeface="Estrangelo Edessa"/>
+        <a:font script="Syrj" typeface="Estrangelo Edessa"/>
+        <a:font script="Syre" typeface="Estrangelo Edessa"/>
+        <a:font script="Sora" typeface="Nirmala UI"/>
+        <a:font script="Tale" typeface="Microsoft Tai Le"/>
+        <a:font script="Talu" typeface="Microsoft New Tai Lue"/>
+        <a:font script="Tfng" typeface="Ebrima"/>
+      </a:minorFont>
+    </a:fontScheme>
+    <a:fmtScheme name="Office">
+      <a:fillStyleLst>
+        <a:solidFill>
+          <a:schemeClr val="phClr"/>
+        </a:solidFill>
+        <a:gradFill rotWithShape="1">
+          <a:gsLst>
+            <a:gs pos="0">
+              <a:schemeClr val="phClr">
+                <a:lumMod val="110000"/>
+                <a:satMod val="105000"/>
+                <a:tint val="67000"/>
+              </a:schemeClr>
+            </a:gs>
+            <a:gs pos="50000">
+              <a:schemeClr val="phClr">
+                <a:lumMod val="105000"/>
+                <a:satMod val="103000"/>
+                <a:tint val="73000"/>
+              </a:schemeClr>
+            </a:gs>
+            <a:gs pos="100000">
+              <a:schemeClr val="phClr">
+                <a:lumMod val="105000"/>
+                <a:satMod val="109000"/>
+                <a:tint val="81000"/>
+              </a:schemeClr>
+            </a:gs>
+          </a:gsLst>
+          <a:lin ang="5400000" scaled="0"/>
+        </a:gradFill>
+        <a:gradFill rotWithShape="1">
+          <a:gsLst>
+            <a:gs pos="0">
+              <a:schemeClr val="phClr">
+                <a:satMod val="103000"/>
+                <a:lumMod val="102000"/>
+                <a:tint val="94000"/>
+              </a:schemeClr>
+            </a:gs>
+            <a:gs pos="50000">
+              <a:schemeClr val="phClr">
+                <a:satMod val="110000"/>
+                <a:lumMod val="100000"/>
+                <a:shade val="100000"/>
+              </a:schemeClr>
+            </a:gs>
+            <a:gs pos="100000">
+              <a:schemeClr val="phClr">
+                <a:lumMod val="99000"/>
+                <a:satMod val="120000"/>
+                <a:shade val="78000"/>
+              </a:schemeClr>
+            </a:gs>
+          </a:gsLst>
+          <a:lin ang="5400000" scaled="0"/>
+        </a:gradFill>
+      </a:fillStyleLst>
+      <a:lnStyleLst>
+        <a:ln w="12700" cap="flat" cmpd="sng" algn="ctr">
+          <a:solidFill>
+            <a:schemeClr val="phClr"/>
+          </a:solidFill>
+          <a:prstDash val="solid"/>
+          <a:miter lim="800000"/>
+        </a:ln>
+        <a:ln w="19050" cap="flat" cmpd="sng" algn="ctr">
+          <a:solidFill>
+            <a:schemeClr val="phClr"/>
+          </a:solidFill>
+          <a:prstDash val="solid"/>
+          <a:miter lim="800000"/>
+        </a:ln>
+        <a:ln w="25400" cap="flat" cmpd="sng" algn="ctr">
+          <a:solidFill>
+            <a:schemeClr val="phClr"/>
+          </a:solidFill>
+          <a:prstDash val="solid"/>
+          <a:miter lim="800000"/>
+        </a:ln>
+      </a:lnStyleLst>
+      <a:effectStyleLst>
+        <a:effectStyle>
+          <a:effectLst/>
+        </a:effectStyle>
+        <a:effectStyle>
+          <a:effectLst/>
+        </a:effectStyle>
+        <a:effectStyle>
+          <a:effectLst>
+            <a:outerShdw blurRad="57150" dist="19050" dir="5400000" algn="ctr" rotWithShape="0">
+              <a:srgbClr val="000000">
+                <a:alpha val="63000"/>
+              </a:srgbClr>
+            </a:outerShdw>
+          </a:effectLst>
+        </a:effectStyle>
+      </a:effectStyleLst>
+      <a:bgFillStyleLst>
+        <a:solidFill>
+          <a:schemeClr val="phClr"/>
+        </a:solidFill>
+        <a:solidFill>
+          <a:schemeClr val="phClr">
+            <a:tint val="95000"/>
+            <a:satMod val="170000"/>
+          </a:schemeClr>
+        </a:solidFill>
+        <a:gradFill rotWithShape="1">
+          <a:gsLst>
+            <a:gs pos="0">
+              <a:schemeClr val="phClr">
+                <a:tint val="93000"/>
+                <a:satMod val="150000"/>
+                <a:shade val="98000"/>
+                <a:lumMod val="102000"/>
+              </a:schemeClr>
+            </a:gs>
+            <a:gs pos="50000">
+              <a:schemeClr val="phClr">
+                <a:tint val="98000"/>
+                <a:satMod val="130000"/>
+                <a:shade val="90000"/>
+                <a:lumMod val="103000"/>
+              </a:schemeClr>
+            </a:gs>
+            <a:gs pos="100000">
+              <a:schemeClr val="phClr">
+                <a:shade val="63000"/>
+                <a:satMod val="120000"/>
+              </a:schemeClr>
+            </a:gs>
+          </a:gsLst>
+          <a:lin ang="5400000" scaled="0"/>
+        </a:gradFill>
+      </a:bgFillStyleLst>
+    </a:fmtScheme>
+  </a:themeElements>
+  <a:objectDefaults>
+    <a:lnDef>
+      <a:spPr/>
+      <a:bodyPr/>
+      <a:lstStyle/>
+      <a:style>
+        <a:lnRef idx="2">
+          <a:schemeClr val="accent1"/>
+        </a:lnRef>
+        <a:fillRef idx="0">
+          <a:schemeClr val="accent1"/>
+        </a:fillRef>
+        <a:effectRef idx="1">
+          <a:schemeClr val="accent1"/>
+        </a:effectRef>
+        <a:fontRef idx="minor">
+          <a:schemeClr val="tx1"/>
+        </a:fontRef>
+      </a:style>
+    </a:lnDef>
+  </a:objectDefaults>
+  <a:extraClrSchemeLst/>
+  <a:extLst>
+    <a:ext uri="{05A4C25C-085E-4340-85A3-A5531E510DB2}">
+      <thm15:themeFamily xmlns:thm15="http://schemas.microsoft.com/office/thememl/2012/main" name="Office Theme" id="{2E142A2C-CD16-42D6-873A-C26D2A0506FA}" vid="{1BDDFF52-6CD6-40A5-AB3C-68EB2F1E4D0A}"/>
+    </a:ext>
+  </a:extLst>
+</a:theme>
 </file>
</xml_diff>

<commit_message>
changed model to qwen3.8-27b
</commit_message>
<xml_diff>
--- a/Capstone_Proposal.docx
+++ b/Capstone_Proposal.docx
@@ -28,7 +28,7 @@
           <w:sz w:val="24"/>
           <w:szCs w:val="24"/>
         </w:rPr>
-        <w:t>Natural-Language Playlist-Builder Agent</w:t>
+        <w:t>Natural Language Playlist Builder Agent</w:t>
       </w:r>
     </w:p>
     <w:tbl>
@@ -89,21 +89,13 @@
               <w:t>Ephraim T</w:t>
             </w:r>
             <w:r>
-              <w:t xml:space="preserve">homas </w:t>
-            </w:r>
-            <w:proofErr w:type="gramStart"/>
-            <w:r>
-              <w:t>J</w:t>
+              <w:t>homas Jacob</w:t>
             </w:r>
             <w:r>
-              <w:t>acob</w:t>
+              <w:t xml:space="preserve">  (e</w:t>
             </w:r>
             <w:r>
-              <w:t xml:space="preserve">  (</w:t>
-            </w:r>
-            <w:proofErr w:type="gramEnd"/>
-            <w:r>
-              <w:t>ejacob32@asu.edu</w:t>
+              <w:t>jacob32@asu.edu</w:t>
             </w:r>
             <w:r>
               <w:t>)</w:t>
@@ -145,7 +137,7 @@
               <w:spacing w:after="100"/>
             </w:pPr>
             <w:r>
-              <w:t>Natural-Language Playlist-Builder Agent</w:t>
+              <w:t>Natural Language Playlist Builder Agent</w:t>
             </w:r>
           </w:p>
         </w:tc>
@@ -255,13 +247,7 @@
         <w:t xml:space="preserve">Task. </w:t>
       </w:r>
       <w:r>
-        <w:t>Given a plain</w:t>
-      </w:r>
-      <w:r>
-        <w:t xml:space="preserve"> </w:t>
-      </w:r>
-      <w:r>
-        <w:t>English description of a desired playlist (a mood, activity, era, or genre), the agent selects real tracks from a Spotify dataset by filtering on audio features and returns a playlist that matches the request.</w:t>
+        <w:t>You describe the playlist you want in plain English, giving a mood, an activity, an era, or a genre. The agent then picks real tracks out of a Spotify dataset by filtering on their audio features, and it hands you back a playlist that fits what you asked for. It never makes up songs.</w:t>
       </w:r>
     </w:p>
     <w:p>
@@ -273,22 +259,10 @@
           <w:b/>
           <w:bCs/>
         </w:rPr>
-        <w:t xml:space="preserve">Intended user &amp; situation. </w:t>
-      </w:r>
-      <w:r>
-        <w:t>A listener who wants a playlist for a specific vibe or activity (“high</w:t>
-      </w:r>
-      <w:r>
-        <w:t xml:space="preserve"> </w:t>
-      </w:r>
-      <w:r>
-        <w:t>energy pop for a workout”) but does not want to hand</w:t>
-      </w:r>
-      <w:r>
-        <w:t xml:space="preserve"> </w:t>
-      </w:r>
-      <w:r>
-        <w:t>pick tracks or translate their taste into audio-feature filters.</w:t>
+        <w:t xml:space="preserve">Who it is for. </w:t>
+      </w:r>
+      <w:r>
+        <w:t>A listener who wants a playlist for a particular mood or activity, for example upbeat pop for a workout, but does not want to choose every track by hand or turn their taste into audio feature filters themselves.</w:t>
       </w:r>
     </w:p>
     <w:p>
@@ -303,13 +277,7 @@
         <w:t xml:space="preserve">Input. </w:t>
       </w:r>
       <w:r>
-        <w:t>(1) a natural</w:t>
-      </w:r>
-      <w:r>
-        <w:t xml:space="preserve"> </w:t>
-      </w:r>
-      <w:r>
-        <w:t>language playlist request (a text file), and (2) the Spotify tracks dataset (CSV, ~33k tracks).</w:t>
+        <w:t>Two things: a request written in plain English (a text file), and the Spotify tracks dataset (a CSV of roughly 33,000 tracks).</w:t>
       </w:r>
     </w:p>
     <w:p>
@@ -324,7 +292,7 @@
         <w:t xml:space="preserve">Output. </w:t>
       </w:r>
       <w:r>
-        <w:t>A playlist: a one-line summary of the filters applied, followed by a numbered list of tracks with title, artist, genre, release year, and key audio features.</w:t>
+        <w:t>A playlist. First a short summary of the filters the agent applied, and then a numbered list of tracks, each showing the title, artist, genre, release year, and a few key audio features.</w:t>
       </w:r>
     </w:p>
     <w:p>
@@ -336,10 +304,10 @@
           <w:b/>
           <w:bCs/>
         </w:rPr>
-        <w:t xml:space="preserve">Success. </w:t>
-      </w:r>
-      <w:r>
-        <w:t>Every returned track satisfies the constraints stated or implied by the request (genre, era, energy/mood, …), the number of tracks matches the request, there are no duplicates, and every track exists in the dataset.</w:t>
+        <w:t xml:space="preserve">What counts as success. </w:t>
+      </w:r>
+      <w:r>
+        <w:t>Every track that comes back fits the constraints the request stated or implied, such as genre, era, energy, or mood. The number of tracks matches what was asked for, there are no duplicates, and every track really exists in the dataset.</w:t>
       </w:r>
     </w:p>
     <w:p>
@@ -351,10 +319,10 @@
           <w:b/>
           <w:bCs/>
         </w:rPr>
-        <w:t xml:space="preserve">Failure. </w:t>
-      </w:r>
-      <w:r>
-        <w:t>A track violates a stated constraint, the wrong number of songs is returned, duplicates appear, or a track is hallucinated (not in the dataset).</w:t>
+        <w:t xml:space="preserve">What counts as failure. </w:t>
+      </w:r>
+      <w:r>
+        <w:t>A track breaks one of the stated constraints, the wrong number of songs comes back, duplicates slip in, or the agent returns a song that is not actually in the dataset.</w:t>
       </w:r>
     </w:p>
     <w:p>
@@ -383,7 +351,7 @@
         <w:t xml:space="preserve">Why it matters. </w:t>
       </w:r>
       <w:r>
-        <w:t>Playlist curation is a core music-listening task. Describing what you want in words is natural, but mapping that description onto concrete audio-feature filters (tempo, energy, valence…) is not something end-users do — an agent can bridge that gap.</w:t>
+        <w:t>Putting together a good playlist is one of the most common things people do with music. Saying what you want in words comes naturally, but turning that into concrete filters over features like tempo, energy, and valence is not something most listeners want to do. An agent can close that gap for them.</w:t>
       </w:r>
     </w:p>
     <w:p>
@@ -395,10 +363,10 @@
           <w:b/>
           <w:bCs/>
         </w:rPr>
-        <w:t xml:space="preserve">Why an agentic approach. </w:t>
-      </w:r>
-      <w:r>
-        <w:t>The task requires interpreting fuzzy language, exploring the catalog, and composing and executing filters iteratively rather than a single model call. Grounding every pick in the real catalog is what prevents hallucinated songs.</w:t>
+        <w:t xml:space="preserve">Why an agentic approach fits. </w:t>
+      </w:r>
+      <w:r>
+        <w:t>The job calls for reading loosely worded requests, exploring the catalog, and then building and running filters step by step. That is tool use over a dataset, not a single model call. Grounding every choice in the real catalog is exactly what keeps the agent from inventing songs.</w:t>
       </w:r>
     </w:p>
     <w:p>
@@ -423,7 +391,7 @@
         <w:spacing w:after="60"/>
       </w:pPr>
       <w:r>
-        <w:t>A single ~33k-track dataset; constraints on genre, release era, and audio features (energy, danceability, valence/mood, acousticness, tempo, popularity).</w:t>
+        <w:t>A single dataset of about 33,000 tracks, with constraints on genre, release era, and audio features such as energy, danceability, valence or mood, acousticness, tempo, and popularity.</w:t>
       </w:r>
     </w:p>
     <w:p>
@@ -436,19 +404,7 @@
         <w:spacing w:after="60"/>
       </w:pPr>
       <w:r>
-        <w:t>A tool</w:t>
-      </w:r>
-      <w:r>
-        <w:t xml:space="preserve"> </w:t>
-      </w:r>
-      <w:r>
-        <w:t xml:space="preserve">use loop that filters the catalog, de-duplicates, and </w:t>
-      </w:r>
-      <w:r>
-        <w:t>honors</w:t>
-      </w:r>
-      <w:r>
-        <w:t xml:space="preserve"> a requested track count.</w:t>
+        <w:t>A tool use loop that filters the catalog, removes duplicate tracks, and returns the number of songs the request asked for.</w:t>
       </w:r>
     </w:p>
     <w:p>
@@ -461,7 +417,7 @@
         <w:spacing w:after="60"/>
       </w:pPr>
       <w:r>
-        <w:t>At least two concrete test requests and a constraint-satisfaction check.</w:t>
+        <w:t>At least two concrete test requests, along with a check that the returned tracks satisfy the constraints.</w:t>
       </w:r>
     </w:p>
     <w:p>
@@ -473,7 +429,7 @@
           <w:b/>
           <w:bCs/>
         </w:rPr>
-        <w:t xml:space="preserve">Intentionally out of scope: </w:t>
+        <w:t xml:space="preserve">Left out of scope: </w:t>
       </w:r>
     </w:p>
     <w:p>
@@ -486,7 +442,7 @@
         <w:spacing w:after="60"/>
       </w:pPr>
       <w:r>
-        <w:t>Creating/playing playlists via the real Spotify API (a planned later extension), and raw audio-signal analysis.</w:t>
+        <w:t>Creating or playing the playlist through the real Spotify service, and any analysis of the raw audio signal.</w:t>
       </w:r>
     </w:p>
     <w:p>
@@ -499,7 +455,7 @@
         <w:spacing w:after="60"/>
       </w:pPr>
       <w:r>
-        <w:t>Personalization from listening history, multi-dataset catalogs, and requests needing knowledge outside the provided features (e.g. lyrical themes).</w:t>
+        <w:t>Personalization from a listener's history, catalogs that span several datasets, and requests that need knowledge the features do not carry, such as what a song's lyrics are about.</w:t>
       </w:r>
     </w:p>
     <w:p>
@@ -528,7 +484,7 @@
         <w:t xml:space="preserve">Type. </w:t>
       </w:r>
       <w:r>
-        <w:t>A tool-use / agentic-loop baseline.</w:t>
+        <w:t>A tool use baseline built around an agentic loop.</w:t>
       </w:r>
     </w:p>
     <w:p>
@@ -540,7 +496,8 @@
           <w:b/>
           <w:bCs/>
         </w:rPr>
-        <w:t xml:space="preserve">Model, tools, libraries. </w:t>
+        <w:lastRenderedPageBreak/>
+        <w:t xml:space="preserve">Model, tools, and libraries. </w:t>
       </w:r>
       <w:r>
         <w:t xml:space="preserve">Python 3.13, </w:t>
@@ -565,7 +522,7 @@
         <w:t>openai</w:t>
       </w:r>
       <w:r>
-        <w:t xml:space="preserve"> SDK pointed at an OpenAI-compatible endpoint. The reference run uses Groq’s free tier with model </w:t>
+        <w:t xml:space="preserve"> SDK aimed at an OpenAI compatible endpoint. The reference setup runs on Groq's free tier with the default model </w:t>
       </w:r>
       <w:r>
         <w:rPr>
@@ -573,10 +530,10 @@
           <w:sz w:val="19"/>
           <w:szCs w:val="19"/>
         </w:rPr>
-        <w:t>openai/gpt-oss-120b</w:t>
-      </w:r>
-      <w:r>
-        <w:t xml:space="preserve">. Dataset: the TidyTuesday </w:t>
+        <w:t>qwen/qwen3.8-27b</w:t>
+      </w:r>
+      <w:r>
+        <w:t xml:space="preserve">, a light model chosen to stay comfortably inside the free tier limits while still handling tool calls reliably. The data is the TidyTuesday </w:t>
       </w:r>
       <w:r>
         <w:rPr>
@@ -587,7 +544,7 @@
         <w:t>spotify_songs.csv</w:t>
       </w:r>
       <w:r>
-        <w:t xml:space="preserve"> (~33k tracks), hosted on GitHub and auto-downloaded on first run.</w:t>
+        <w:t xml:space="preserve"> file of roughly 33,000 tracks, hosted on GitHub and downloaded automatically the first time you run the baseline.</w:t>
       </w:r>
     </w:p>
     <w:p>
@@ -612,8 +569,7 @@
         <w:spacing w:after="60"/>
       </w:pPr>
       <w:r>
-        <w:lastRenderedPageBreak/>
-        <w:t xml:space="preserve">Ensures the dataset is present (downloads it from GitHub if missing) and loads it into a DataFrame </w:t>
+        <w:t xml:space="preserve">It makes sure the dataset is there, downloading it from GitHub if needed, and loads it into a DataFrame called </w:t>
       </w:r>
       <w:r>
         <w:rPr>
@@ -637,7 +593,7 @@
         <w:spacing w:after="60"/>
       </w:pPr>
       <w:r>
-        <w:t>Builds a system prompt describing the schema, the meaning of each audio feature, and a de-duplication rule.</w:t>
+        <w:t>It builds a system prompt that describes the columns, explains what each audio feature means, and tells the model to remove duplicate tracks.</w:t>
       </w:r>
     </w:p>
     <w:p>
@@ -650,7 +606,7 @@
         <w:spacing w:after="60"/>
       </w:pPr>
       <w:r>
-        <w:t xml:space="preserve">Sends the user’s request to the model with a single tool, </w:t>
+        <w:t xml:space="preserve">It sends the request to the model together with a single tool, </w:t>
       </w:r>
       <w:r>
         <w:rPr>
@@ -674,7 +630,7 @@
         <w:spacing w:after="60"/>
       </w:pPr>
       <w:r>
-        <w:t xml:space="preserve">When the model calls the tool, the code runs against </w:t>
+        <w:t xml:space="preserve">When the model calls that tool, the code runs against </w:t>
       </w:r>
       <w:r>
         <w:rPr>
@@ -685,7 +641,7 @@
         <w:t>df</w:t>
       </w:r>
       <w:r>
-        <w:t xml:space="preserve"> and its printed output is returned to the model.</w:t>
+        <w:t xml:space="preserve"> and whatever it prints goes back to the model.</w:t>
       </w:r>
     </w:p>
     <w:p>
@@ -698,7 +654,7 @@
         <w:spacing w:after="60"/>
       </w:pPr>
       <w:r>
-        <w:t>The loop repeats (bounded to 12 steps) until the model returns a filter summary and a numbered playlist, which is printed and saved to outputs/.</w:t>
+        <w:t>The loop keeps going, up to a limit of 12 turns, until the model returns a filter summary and a numbered playlist, which is printed and saved into the outputs folder.</w:t>
       </w:r>
     </w:p>
     <w:p>
@@ -710,10 +666,10 @@
           <w:b/>
           <w:bCs/>
         </w:rPr>
-        <w:t xml:space="preserve">Why this is a reasonable start. </w:t>
-      </w:r>
-      <w:r>
-        <w:t>It is minimal yet genuinely agentic (real iterative tool use), grounds every selection in the real catalog, produces a measurable output (constraint satisfaction), and extends naturally to the live Spotify API.</w:t>
+        <w:t xml:space="preserve">Why this is a reasonable starting point. </w:t>
+      </w:r>
+      <w:r>
+        <w:t>It is small but genuinely agentic, since the model really does use a tool and iterate. It grounds every pick in the real catalog, it produces something you can measure by checking constraints, and it leaves a clear path toward the live Spotify service later on.</w:t>
       </w:r>
     </w:p>
     <w:p>
@@ -736,7 +692,7 @@
         <w:t>run_baseline.py</w:t>
       </w:r>
       <w:r>
-        <w:t xml:space="preserve"> (agent, loop, tool), </w:t>
+        <w:t xml:space="preserve"> holds the agent, the loop, and the tool. </w:t>
       </w:r>
       <w:r>
         <w:rPr>
@@ -747,7 +703,7 @@
         <w:t>examples/spotify_songs.csv</w:t>
       </w:r>
       <w:r>
-        <w:t xml:space="preserve"> (data), </w:t>
+        <w:t xml:space="preserve"> is the data. </w:t>
       </w:r>
       <w:r>
         <w:rPr>
@@ -758,7 +714,7 @@
         <w:t>examples/test1.txt</w:t>
       </w:r>
       <w:r>
-        <w:t xml:space="preserve"> / </w:t>
+        <w:t xml:space="preserve"> and </w:t>
       </w:r>
       <w:r>
         <w:rPr>
@@ -769,7 +725,7 @@
         <w:t>examples/test2.txt</w:t>
       </w:r>
       <w:r>
-        <w:t xml:space="preserve"> (requests), </w:t>
+        <w:t xml:space="preserve"> are the requests. </w:t>
       </w:r>
       <w:r>
         <w:rPr>
@@ -780,7 +736,7 @@
         <w:t>examples/readme.md</w:t>
       </w:r>
       <w:r>
-        <w:t xml:space="preserve"> (config), </w:t>
+        <w:t xml:space="preserve"> is the configuration guide. </w:t>
       </w:r>
       <w:r>
         <w:rPr>
@@ -791,7 +747,7 @@
         <w:t>requirements.txt</w:t>
       </w:r>
       <w:r>
-        <w:t xml:space="preserve">, and </w:t>
+        <w:t xml:space="preserve"> lists the dependencies, and the </w:t>
       </w:r>
       <w:r>
         <w:rPr>
@@ -802,7 +758,7 @@
         <w:t>outputs/</w:t>
       </w:r>
       <w:r>
-        <w:t>.</w:t>
+        <w:t xml:space="preserve"> folder holds the results.</w:t>
       </w:r>
     </w:p>
     <w:p>
@@ -828,10 +784,10 @@
           <w:b/>
           <w:bCs/>
         </w:rPr>
-        <w:t xml:space="preserve">Test 1 — request: </w:t>
-      </w:r>
-      <w:r>
-        <w:t>“Build me a 10-song playlist of high-energy pop songs from the 2010s for a workout.”</w:t>
+        <w:t xml:space="preserve">Test 1, the request: </w:t>
+      </w:r>
+      <w:r>
+        <w:t>“Build me a 10 song playlist of high energy pop songs from the 2010s for a workout.”</w:t>
       </w:r>
     </w:p>
     <w:p>
@@ -843,34 +799,20 @@
           <w:b/>
           <w:bCs/>
         </w:rPr>
-        <w:t xml:space="preserve">Expected </w:t>
-      </w:r>
-      <w:r>
-        <w:rPr>
-          <w:b/>
-          <w:bCs/>
-        </w:rPr>
-        <w:t>behavior</w:t>
-      </w:r>
-      <w:r>
-        <w:rPr>
-          <w:b/>
-          <w:bCs/>
-        </w:rPr>
-        <w:t xml:space="preserve">: </w:t>
-      </w:r>
-      <w:r>
-        <w:t xml:space="preserve">10 distinct pop tracks released 2010–2019 with high energy (the dataset holds 2,548 candidate pop / 2010s / high-energy tracks). </w:t>
-      </w:r>
-      <w:r>
-        <w:rPr>
-          <w:b/>
-          <w:bCs/>
-        </w:rPr>
-        <w:t xml:space="preserve">Actual: </w:t>
-      </w:r>
-      <w:r>
-        <w:t xml:space="preserve">the agent filtered to pop + 2010–2019 + energy ≥ 0.75, de-duplicated on track + artist, and returned the 10 most popular matches (e.g. “Blinding Lights – The Weeknd”, “Don’t Start Now – Dua Lipa”). </w:t>
+        <w:t xml:space="preserve">Expected behaviour: </w:t>
+      </w:r>
+      <w:r>
+        <w:t xml:space="preserve">ten different pop tracks released between 2010 and 2019 with high energy. The dataset holds 2,548 tracks that qualify as pop, from the 2010s, and high in energy. </w:t>
+      </w:r>
+      <w:r>
+        <w:rPr>
+          <w:b/>
+          <w:bCs/>
+        </w:rPr>
+        <w:t xml:space="preserve">What actually happened: </w:t>
+      </w:r>
+      <w:r>
+        <w:t>the agent filtered to pop tracks from 2010 to 2019 with energy of at least 0.85 and danceability of at least 0.75, removed duplicates by title and artist, and returned ten tracks, for example “One Kiss” by Calvin Harris and “Never Really Over” by Katy Perry. ✓</w:t>
       </w:r>
     </w:p>
     <w:p>
@@ -882,10 +824,10 @@
           <w:b/>
           <w:bCs/>
         </w:rPr>
-        <w:t xml:space="preserve">Test 2 — request: </w:t>
-      </w:r>
-      <w:r>
-        <w:t>“I want a chill 8-song playlist of calm, low-energy acoustic songs for studying.”</w:t>
+        <w:t xml:space="preserve">Test 2, the request: </w:t>
+      </w:r>
+      <w:r>
+        <w:t>“I want a chill 8 song playlist of calm, low energy acoustic songs for studying.”</w:t>
       </w:r>
     </w:p>
     <w:p>
@@ -897,34 +839,20 @@
           <w:b/>
           <w:bCs/>
         </w:rPr>
-        <w:t xml:space="preserve">Expected </w:t>
-      </w:r>
-      <w:r>
-        <w:rPr>
-          <w:b/>
-          <w:bCs/>
-        </w:rPr>
-        <w:t>behavior</w:t>
-      </w:r>
-      <w:r>
-        <w:rPr>
-          <w:b/>
-          <w:bCs/>
-        </w:rPr>
-        <w:t xml:space="preserve">: </w:t>
-      </w:r>
-      <w:r>
-        <w:t xml:space="preserve">8 distinct low-energy, high-acousticness tracks. </w:t>
-      </w:r>
-      <w:r>
-        <w:rPr>
-          <w:b/>
-          <w:bCs/>
-        </w:rPr>
-        <w:t xml:space="preserve">Actual: </w:t>
-      </w:r>
-      <w:r>
-        <w:t xml:space="preserve">the agent filtered to low energy + high acousticness + low danceability (≈ energy ≤ 0.35, acousticness ≥ 0.85), de-duplicated, and returned 8 tracks (e.g. “lovely – Billie Eilish”, “Mad World – Gary Jules”). </w:t>
+        <w:t xml:space="preserve">Expected behaviour: </w:t>
+      </w:r>
+      <w:r>
+        <w:t xml:space="preserve">eight different tracks that are low in energy and high in acousticness. </w:t>
+      </w:r>
+      <w:r>
+        <w:rPr>
+          <w:b/>
+          <w:bCs/>
+        </w:rPr>
+        <w:t xml:space="preserve">What actually happened: </w:t>
+      </w:r>
+      <w:r>
+        <w:t>the agent filtered to tracks with high acousticness (0.7 or more), low energy (0.4 or less), and a calm mood (valence below 0.5), removed duplicates, and returned eight tracks, for example “everything i wanted” by Billie Eilish and “All of Me” by John Legend. ✓</w:t>
       </w:r>
     </w:p>
     <w:p>
@@ -937,8 +865,8 @@
           <w:noProof/>
         </w:rPr>
         <w:drawing>
-          <wp:inline distT="0" distB="0" distL="0" distR="0" wp14:anchorId="6A60758D" wp14:editId="118AA294">
-            <wp:extent cx="5334000" cy="1819275"/>
+          <wp:inline distT="0" distB="0" distL="0" distR="0" wp14:anchorId="7F4FCF3D" wp14:editId="33CE532B">
+            <wp:extent cx="5334000" cy="1409700"/>
             <wp:effectExtent l="0" t="0" r="0" b="0"/>
             <wp:docPr id="1" name="Picture 1"/>
             <wp:cNvGraphicFramePr>
@@ -963,7 +891,7 @@
                   <pic:spPr bwMode="auto">
                     <a:xfrm>
                       <a:off x="0" y="0"/>
-                      <a:ext cx="5334000" cy="1819275"/>
+                      <a:ext cx="5334000" cy="1409700"/>
                     </a:xfrm>
                     <a:prstGeom prst="rect">
                       <a:avLst/>
@@ -988,7 +916,7 @@
           <w:sz w:val="18"/>
           <w:szCs w:val="18"/>
         </w:rPr>
-        <w:t>Test 1 — high-energy 2010s pop workout playlist (your terminal).</w:t>
+        <w:t>Test 1: a high energy 2010s pop workout playlist, run in the student's own terminal.</w:t>
       </w:r>
     </w:p>
     <w:p>
@@ -1000,11 +928,12 @@
         <w:rPr>
           <w:noProof/>
         </w:rPr>
+        <w:lastRenderedPageBreak/>
         <w:drawing>
-          <wp:inline distT="0" distB="0" distL="0" distR="0" wp14:anchorId="0E8BC104" wp14:editId="2278613D">
-            <wp:extent cx="5334000" cy="1866900"/>
+          <wp:inline distT="0" distB="0" distL="0" distR="0" wp14:anchorId="0D5963C7" wp14:editId="395583E3">
+            <wp:extent cx="5334000" cy="1476375"/>
             <wp:effectExtent l="0" t="0" r="0" b="0"/>
-            <wp:docPr id="706504627" name="Picture 706504627"/>
+            <wp:docPr id="287599878" name="Picture 287599878"/>
             <wp:cNvGraphicFramePr>
               <a:graphicFrameLocks xmlns:a="http://schemas.openxmlformats.org/drawingml/2006/main" noChangeAspect="1"/>
             </wp:cNvGraphicFramePr>
@@ -1027,7 +956,7 @@
                   <pic:spPr bwMode="auto">
                     <a:xfrm>
                       <a:off x="0" y="0"/>
-                      <a:ext cx="5334000" cy="1866900"/>
+                      <a:ext cx="5334000" cy="1476375"/>
                     </a:xfrm>
                     <a:prstGeom prst="rect">
                       <a:avLst/>
@@ -1052,7 +981,7 @@
           <w:sz w:val="18"/>
           <w:szCs w:val="18"/>
         </w:rPr>
-        <w:t>Test 2 — calm low-energy acoustic study playlist (your terminal).</w:t>
+        <w:t>Test 2: a calm, low energy acoustic study playlist, run in the student's own terminal.</w:t>
       </w:r>
     </w:p>
     <w:p>
@@ -1067,7 +996,7 @@
         <w:t xml:space="preserve">What worked. </w:t>
       </w:r>
       <w:r>
-        <w:t xml:space="preserve">The agent reliably turns fuzzy language (“high-energy”, “chill”) into concrete feature thresholds, grounds every pick in the catalog, and de-duplicates. </w:t>
+        <w:t xml:space="preserve">The agent turned loose wording like “high energy” and “chill” into concrete feature thresholds, grounded every pick in the catalog, and removed duplicates. </w:t>
       </w:r>
       <w:r>
         <w:rPr>
@@ -1077,11 +1006,7 @@
         <w:t xml:space="preserve">What did not. </w:t>
       </w:r>
       <w:r>
-        <w:t xml:space="preserve">The thresholds are the model’s own ad-hoc choices and vary from run to run; genre labels are playlist-derived and noisy (some “pop” rows lean reggaeton); there </w:t>
-      </w:r>
-      <w:r>
-        <w:lastRenderedPageBreak/>
-        <w:t>is no guarantee of exactly N tracks if filters are too strict; and the baseline does not verify after the fact that each returned track actually satisfies the stated filters.</w:t>
+        <w:t>The thresholds are the model's own choices and shift from one run to the next. The genre labels come from playlists and are a little noisy, so some tracks marked pop lean toward reggaeton. There is no promise of exactly the requested number of songs if the filters are too strict, and the baseline does not go back afterward to confirm that each returned track really meets the stated filters.</w:t>
       </w:r>
     </w:p>
     <w:p>
@@ -1151,7 +1076,7 @@
         <w:t>OPENAI_API_KEY</w:t>
       </w:r>
       <w:r>
-        <w:t xml:space="preserve"> to a key from console.groq.com/keys and </w:t>
+        <w:t xml:space="preserve"> to a key from console.groq.com/keys and set </w:t>
       </w:r>
       <w:r>
         <w:rPr>
@@ -1162,7 +1087,7 @@
         <w:t>OPENAI_BASE_URL=https://api.groq.com/openai/v1</w:t>
       </w:r>
       <w:r>
-        <w:t xml:space="preserve">. (For OpenAI instead: set only </w:t>
+        <w:t xml:space="preserve">. To use OpenAI instead, set only </w:t>
       </w:r>
       <w:r>
         <w:rPr>
@@ -1173,7 +1098,7 @@
         <w:t>OPENAI_API_KEY</w:t>
       </w:r>
       <w:r>
-        <w:t xml:space="preserve"> and use </w:t>
+        <w:t xml:space="preserve"> and pass </w:t>
       </w:r>
       <w:r>
         <w:rPr>
@@ -1184,7 +1109,7 @@
         <w:t>--model gpt-4o-mini</w:t>
       </w:r>
       <w:r>
-        <w:t>.)</w:t>
+        <w:t>.</w:t>
       </w:r>
     </w:p>
     <w:p>
@@ -1215,7 +1140,7 @@
         <w:t>examples/spotify_songs.csv</w:t>
       </w:r>
       <w:r>
-        <w:t>; auto-downloaded from GitHub on first run if missing (no Kaggle account needed).</w:t>
+        <w:t>, and downloaded from GitHub on the first run if it is missing, with no Kaggle account needed.</w:t>
       </w:r>
     </w:p>
     <w:p>
@@ -1240,7 +1165,10 @@
           <w:sz w:val="19"/>
           <w:szCs w:val="19"/>
         </w:rPr>
-        <w:t>py -3.13 run_baseline.py --input examples/test1.txt --model openai/gpt-oss-120b</w:t>
+        <w:t>py -3.13 run_baseline.py --input examples/test1.txt</w:t>
+      </w:r>
+      <w:r>
+        <w:t>.</w:t>
       </w:r>
     </w:p>
     <w:p>
@@ -1278,7 +1206,7 @@
         <w:t xml:space="preserve">Output: </w:t>
       </w:r>
       <w:r>
-        <w:t xml:space="preserve">printed to console and saved to </w:t>
+        <w:t xml:space="preserve">printed to the console and saved to </w:t>
       </w:r>
       <w:r>
         <w:rPr>
@@ -1309,7 +1237,7 @@
         <w:t xml:space="preserve">Known limitations: </w:t>
       </w:r>
       <w:r>
-        <w:t>the model must support tool calling; free tiers are rate-limited (retry on HTTP 429).</w:t>
+        <w:t>the model has to support tool calling. Free tiers also limit how many output tokens you can use per minute, so the baseline caps output at 900 tokens per call and retries automatically after a short pause if it hits an HTTP 429.</w:t>
       </w:r>
     </w:p>
     <w:p>
@@ -1331,7 +1259,7 @@
         <w:spacing w:after="100"/>
       </w:pPr>
       <w:r>
-        <w:t>The improved system will be compared to this baseline on a set of playlist requests, each paired with a machine-checkable set of intended constraints:</w:t>
+        <w:t>To compare the improved system against this baseline, I will use a set of playlist requests, each paired with a set of intended constraints that a program can check automatically:</w:t>
       </w:r>
     </w:p>
     <w:p>
@@ -1348,10 +1276,10 @@
           <w:b/>
           <w:bCs/>
         </w:rPr>
-        <w:t xml:space="preserve">Constraint-satisfaction rate </w:t>
-      </w:r>
-      <w:r>
-        <w:t>— fraction of returned tracks that meet every stated constraint (the primary metric).</w:t>
+        <w:t xml:space="preserve">Constraint satisfaction rate. </w:t>
+      </w:r>
+      <w:r>
+        <w:t>The share of returned tracks that meet every stated constraint. This is the main metric.</w:t>
       </w:r>
     </w:p>
     <w:p>
@@ -1368,10 +1296,10 @@
           <w:b/>
           <w:bCs/>
         </w:rPr>
-        <w:t xml:space="preserve">Count correctness </w:t>
-      </w:r>
-      <w:r>
-        <w:t>— returned track count equals the requested count.</w:t>
+        <w:t xml:space="preserve">Count correctness. </w:t>
+      </w:r>
+      <w:r>
+        <w:t>Whether the number of tracks returned matches the number requested.</w:t>
       </w:r>
     </w:p>
     <w:p>
@@ -1388,10 +1316,10 @@
           <w:b/>
           <w:bCs/>
         </w:rPr>
-        <w:t xml:space="preserve">Duplicate &amp; hallucination rate </w:t>
-      </w:r>
-      <w:r>
-        <w:t>— duplicate tracks, and tracks not present in the dataset.</w:t>
+        <w:t xml:space="preserve">Duplicate and hallucination rate. </w:t>
+      </w:r>
+      <w:r>
+        <w:t>How often duplicate tracks appear, or tracks that are not in the dataset at all.</w:t>
       </w:r>
     </w:p>
     <w:p>
@@ -1408,10 +1336,10 @@
           <w:b/>
           <w:bCs/>
         </w:rPr>
-        <w:t xml:space="preserve">Diversity </w:t>
-      </w:r>
-      <w:r>
-        <w:t>— number of unique artists in the playlist.</w:t>
+        <w:t xml:space="preserve">Diversity. </w:t>
+      </w:r>
+      <w:r>
+        <w:t>The number of distinct artists in the playlist.</w:t>
       </w:r>
     </w:p>
     <w:p>
@@ -1428,10 +1356,10 @@
           <w:b/>
           <w:bCs/>
         </w:rPr>
-        <w:t xml:space="preserve">Latency, cost, tool-failure rate </w:t>
-      </w:r>
-      <w:r>
-        <w:t>— wall-clock time, tokens / tool-steps used, and unrecovered code errors.</w:t>
+        <w:t xml:space="preserve">Latency, cost, and tool failure rate. </w:t>
+      </w:r>
+      <w:r>
+        <w:t>Wall clock time, the tokens and tool turns used, and how often code fails to run without recovery.</w:t>
       </w:r>
     </w:p>
     <w:p>
@@ -1448,10 +1376,10 @@
           <w:b/>
           <w:bCs/>
         </w:rPr>
-        <w:t xml:space="preserve">Optional human / LLM-as-judge </w:t>
-      </w:r>
-      <w:r>
-        <w:t>— rating of how well the playlist fits the requested vibe.</w:t>
+        <w:t xml:space="preserve">Optional rating by a person or an LLM judge. </w:t>
+      </w:r>
+      <w:r>
+        <w:t>A score for how well the playlist fits the requested mood.</w:t>
       </w:r>
     </w:p>
     <w:p>
@@ -1459,7 +1387,7 @@
         <w:spacing w:after="100"/>
       </w:pPr>
       <w:r>
-        <w:t>Evidence of improvement: higher constraint-satisfaction and lower duplicate / hallucination rates than the baseline, reliably correct counts, better vibe-fit ratings, and fewer wasted tool steps.</w:t>
+        <w:t>The evidence that the later system is better would be a higher constraint satisfaction rate and a lower duplicate and hallucination rate than the baseline, counts that are reliably correct, better ratings for how well playlists fit the mood, and fewer wasted tool turns.</w:t>
       </w:r>
     </w:p>
     <w:p>
@@ -1485,10 +1413,11 @@
           <w:b/>
           <w:bCs/>
         </w:rPr>
+        <w:lastRenderedPageBreak/>
         <w:t xml:space="preserve">Known weaknesses. </w:t>
       </w:r>
       <w:r>
-        <w:t>Feature thresholds are chosen ad-hoc and are inconsistent between runs; genre labels are noisy; there is no post-hoc validation that returned tracks satisfy the request; model-written code is executed without a real sandbox; only one dataset is supported; there is no personalization.</w:t>
+        <w:t>The feature thresholds are picked on the spot and are not consistent between runs. The genre labels are noisy. Nothing validates afterward that the returned tracks satisfy the request. Code written by the model runs without a real sandbox. Only one dataset is supported, and there is no personalization.</w:t>
       </w:r>
     </w:p>
     <w:p>
@@ -1500,10 +1429,10 @@
           <w:b/>
           <w:bCs/>
         </w:rPr>
-        <w:t xml:space="preserve">Expected failure cases. </w:t>
-      </w:r>
-      <w:r>
-        <w:t>Over-strict filters returning fewer than N tracks; ambiguous requests (“sad but not too sad”); non-English or regional requests; and requests that depend on information not in the audio features (e.g. “songs about summer”). One such case was observed during testing: on the test-2 request the agent looped on near-identical queries and exhausted its step budget without finalizing, which prompted raising the bound from 8 to 12 steps and adding a “be decisive” instruction — a mitigation, not a full fix.</w:t>
+        <w:t xml:space="preserve">Failure cases I expect. </w:t>
+      </w:r>
+      <w:r>
+        <w:t>Filters that are too strict and return fewer songs than asked for, vague requests such as “sad but not too sad,” requests that are not in English or are strongly regional, and requests that depend on information the audio features do not hold, such as “songs about summer.” One case like this showed up during testing. On the second test the agent kept running nearly identical queries and used up its turn budget without finishing, which is why I raised the limit from 8 to 12 turns and added an instruction telling it to be decisive. That is a mitigation rather than a full fix.</w:t>
       </w:r>
     </w:p>
     <w:p>
@@ -1515,10 +1444,24 @@
           <w:b/>
           <w:bCs/>
         </w:rPr>
-        <w:t xml:space="preserve">Next phase. </w:t>
-      </w:r>
-      <w:r>
-        <w:t>Add a validation-and-repair step that checks each track against parsed constraints; standardize the language-to-threshold mapping; guarantee exactly-N with graceful constraint relaxation; connect to the real Spotify API/MCP to create the playlist in the user’s account; and grow the evaluation into a labeled request suite.</w:t>
+        <w:t>What I w</w:t>
+      </w:r>
+      <w:r>
+        <w:rPr>
+          <w:b/>
+          <w:bCs/>
+        </w:rPr>
+        <w:t>ould</w:t>
+      </w:r>
+      <w:r>
+        <w:rPr>
+          <w:b/>
+          <w:bCs/>
+        </w:rPr>
+        <w:t xml:space="preserve"> build next. </w:t>
+      </w:r>
+      <w:r>
+        <w:t>A validation and repair step that checks each track against the parsed constraints, a more consistent way of mapping language to thresholds, a guarantee of exactly the requested number of songs by relaxing constraints gracefully, a connection to the real Spotify service so the playlist can be created in the listener's own account, and a labeled suite of requests for evaluation.</w:t>
       </w:r>
     </w:p>
     <w:p>
@@ -1530,10 +1473,10 @@
           <w:b/>
           <w:bCs/>
         </w:rPr>
-        <w:t xml:space="preserve">Risks &amp; help needed. </w:t>
-      </w:r>
-      <w:r>
-        <w:t>Model availability / rate limits and unsafe code execution are the main risks; defining ground-truth constraints for fuzzy requests takes care. The project would benefit from stable API access and a small labeled request→constraint benchmark.</w:t>
+        <w:t xml:space="preserve">Risks. </w:t>
+      </w:r>
+      <w:r>
+        <w:t>The main risks are model availability and rate limits, and running model written code safely. Writing down reference constraints for vague requests also takes care. The project would benefit from steady API access and a small benchmark that pairs requests with their intended constraints.</w:t>
       </w:r>
     </w:p>
     <w:sectPr>
@@ -1549,96 +1492,10 @@
 <file path=word/numbering.xml><?xml version="1.0" encoding="utf-8"?>
 <w:numbering xmlns:wpc="http://schemas.microsoft.com/office/word/2010/wordprocessingCanvas" xmlns:cx="http://schemas.microsoft.com/office/drawing/2014/chartex" xmlns:cx1="http://schemas.microsoft.com/office/drawing/2015/9/8/chartex" xmlns:cx2="http://schemas.microsoft.com/office/drawing/2015/10/21/chartex" xmlns:cx3="http://schemas.microsoft.com/office/drawing/2016/5/9/chartex" xmlns:cx4="http://schemas.microsoft.com/office/drawing/2016/5/10/chartex" xmlns:cx5="http://schemas.microsoft.com/office/drawing/2016/5/11/chartex" xmlns:cx6="http://schemas.microsoft.com/office/drawing/2016/5/12/chartex" xmlns:cx7="http://schemas.microsoft.com/office/drawing/2016/5/13/chartex" xmlns:cx8="http://schemas.microsoft.com/office/drawing/2016/5/14/chartex" xmlns:mc="http://schemas.openxmlformats.org/markup-compatibility/2006" xmlns:aink="http://schemas.microsoft.com/office/drawing/2016/ink" xmlns:am3d="http://schemas.microsoft.com/office/drawing/2017/model3d" xmlns:o="urn:schemas-microsoft-com:office:office" xmlns:oel="http://schemas.microsoft.com/office/2019/extlst" xmlns:r="http://schemas.openxmlformats.org/officeDocument/2006/relationships" xmlns:m="http://schemas.openxmlformats.org/officeDocument/2006/math" xmlns:v="urn:schemas-microsoft-com:vml" xmlns:wp14="http://schemas.microsoft.com/office/word/2010/wordprocessingDrawing" xmlns:wp="http://schemas.openxmlformats.org/drawingml/2006/wordprocessingDrawing" xmlns:w10="urn:schemas-microsoft-com:office:word" xmlns:w="http://schemas.openxmlformats.org/wordprocessingml/2006/main" xmlns:w14="http://schemas.microsoft.com/office/word/2010/wordml" xmlns:w15="http://schemas.microsoft.com/office/word/2012/wordml" xmlns:w16cex="http://schemas.microsoft.com/office/word/2018/wordml/cex" xmlns:w16cid="http://schemas.microsoft.com/office/word/2016/wordml/cid" xmlns:w16="http://schemas.microsoft.com/office/word/2018/wordml" xmlns:w16du="http://schemas.microsoft.com/office/word/2023/wordml/word16du" xmlns:w16sdtdh="http://schemas.microsoft.com/office/word/2020/wordml/sdtdatahash" xmlns:w16sdtfl="http://schemas.microsoft.com/office/word/2024/wordml/sdtformatlock" xmlns:w16se="http://schemas.microsoft.com/office/word/2015/wordml/symex" xmlns:wpg="http://schemas.microsoft.com/office/word/2010/wordprocessingGroup" xmlns:wpi="http://schemas.microsoft.com/office/word/2010/wordprocessingInk" xmlns:wne="http://schemas.microsoft.com/office/word/2006/wordml" xmlns:wps="http://schemas.microsoft.com/office/word/2010/wordprocessingShape" mc:Ignorable="w14 w15 w16se w16cid w16 w16cex w16sdtdh w16sdtfl w16du wp14">
   <w:abstractNum w:abstractNumId="0" w15:restartNumberingAfterBreak="0">
-    <w:nsid w:val="69BB7046"/>
+    <w:nsid w:val="16225BB2"/>
     <w:multiLevelType w:val="hybridMultilevel"/>
-    <w:tmpl w:val="DA0A71FA"/>
-    <w:lvl w:ilvl="0" w:tplc="DF681E1C">
-      <w:start w:val="1"/>
-      <w:numFmt w:val="bullet"/>
-      <w:lvlText w:val="●"/>
-      <w:lvlJc w:val="left"/>
-      <w:pPr>
-        <w:ind w:left="720" w:hanging="360"/>
-      </w:pPr>
-    </w:lvl>
-    <w:lvl w:ilvl="1" w:tplc="88325EBA">
-      <w:start w:val="1"/>
-      <w:numFmt w:val="bullet"/>
-      <w:lvlText w:val="○"/>
-      <w:lvlJc w:val="left"/>
-      <w:pPr>
-        <w:ind w:left="1440" w:hanging="360"/>
-      </w:pPr>
-    </w:lvl>
-    <w:lvl w:ilvl="2" w:tplc="68D08434">
-      <w:start w:val="1"/>
-      <w:numFmt w:val="bullet"/>
-      <w:lvlText w:val="■"/>
-      <w:lvlJc w:val="left"/>
-      <w:pPr>
-        <w:ind w:left="2160" w:hanging="360"/>
-      </w:pPr>
-    </w:lvl>
-    <w:lvl w:ilvl="3" w:tplc="1D48B148">
-      <w:start w:val="1"/>
-      <w:numFmt w:val="bullet"/>
-      <w:lvlText w:val="●"/>
-      <w:lvlJc w:val="left"/>
-      <w:pPr>
-        <w:ind w:left="2880" w:hanging="360"/>
-      </w:pPr>
-    </w:lvl>
-    <w:lvl w:ilvl="4" w:tplc="AD80A13C">
-      <w:start w:val="1"/>
-      <w:numFmt w:val="bullet"/>
-      <w:lvlText w:val="○"/>
-      <w:lvlJc w:val="left"/>
-      <w:pPr>
-        <w:ind w:left="3600" w:hanging="360"/>
-      </w:pPr>
-    </w:lvl>
-    <w:lvl w:ilvl="5" w:tplc="0426A860">
-      <w:start w:val="1"/>
-      <w:numFmt w:val="bullet"/>
-      <w:lvlText w:val="■"/>
-      <w:lvlJc w:val="left"/>
-      <w:pPr>
-        <w:ind w:left="4320" w:hanging="360"/>
-      </w:pPr>
-    </w:lvl>
-    <w:lvl w:ilvl="6" w:tplc="D5A4783C">
-      <w:start w:val="1"/>
-      <w:numFmt w:val="bullet"/>
-      <w:lvlText w:val="●"/>
-      <w:lvlJc w:val="left"/>
-      <w:pPr>
-        <w:ind w:left="5040" w:hanging="360"/>
-      </w:pPr>
-    </w:lvl>
-    <w:lvl w:ilvl="7" w:tplc="07407116">
-      <w:start w:val="1"/>
-      <w:numFmt w:val="bullet"/>
-      <w:lvlText w:val="●"/>
-      <w:lvlJc w:val="left"/>
-      <w:pPr>
-        <w:ind w:left="5760" w:hanging="360"/>
-      </w:pPr>
-    </w:lvl>
-    <w:lvl w:ilvl="8" w:tplc="E8D839FC">
-      <w:start w:val="1"/>
-      <w:numFmt w:val="bullet"/>
-      <w:lvlText w:val="●"/>
-      <w:lvlJc w:val="left"/>
-      <w:pPr>
-        <w:ind w:left="6480" w:hanging="360"/>
-      </w:pPr>
-    </w:lvl>
-  </w:abstractNum>
-  <w:abstractNum w:abstractNumId="1" w15:restartNumberingAfterBreak="0">
-    <w:nsid w:val="76671EB9"/>
-    <w:multiLevelType w:val="hybridMultilevel"/>
-    <w:tmpl w:val="C8EEFAE6"/>
-    <w:lvl w:ilvl="0" w:tplc="FF1A2C34">
+    <w:tmpl w:val="21B44146"/>
+    <w:lvl w:ilvl="0" w:tplc="961C4816">
       <w:start w:val="1"/>
       <w:numFmt w:val="bullet"/>
       <w:lvlText w:val="•"/>
@@ -1647,55 +1504,141 @@
         <w:ind w:left="360" w:hanging="200"/>
       </w:pPr>
     </w:lvl>
-    <w:lvl w:ilvl="1" w:tplc="355C68C8">
+    <w:lvl w:ilvl="1" w:tplc="06040D90">
       <w:numFmt w:val="decimal"/>
       <w:lvlText w:val=""/>
       <w:lvlJc w:val="left"/>
     </w:lvl>
-    <w:lvl w:ilvl="2" w:tplc="623CF57E">
+    <w:lvl w:ilvl="2" w:tplc="A54E3082">
       <w:numFmt w:val="decimal"/>
       <w:lvlText w:val=""/>
       <w:lvlJc w:val="left"/>
     </w:lvl>
-    <w:lvl w:ilvl="3" w:tplc="9BA23B5A">
+    <w:lvl w:ilvl="3" w:tplc="3ABE0306">
       <w:numFmt w:val="decimal"/>
       <w:lvlText w:val=""/>
       <w:lvlJc w:val="left"/>
     </w:lvl>
-    <w:lvl w:ilvl="4" w:tplc="3E7457DA">
+    <w:lvl w:ilvl="4" w:tplc="73EC9EF8">
       <w:numFmt w:val="decimal"/>
       <w:lvlText w:val=""/>
       <w:lvlJc w:val="left"/>
     </w:lvl>
-    <w:lvl w:ilvl="5" w:tplc="B524C354">
+    <w:lvl w:ilvl="5" w:tplc="2B74487A">
       <w:numFmt w:val="decimal"/>
       <w:lvlText w:val=""/>
       <w:lvlJc w:val="left"/>
     </w:lvl>
-    <w:lvl w:ilvl="6" w:tplc="F61E94B4">
+    <w:lvl w:ilvl="6" w:tplc="C1427766">
       <w:numFmt w:val="decimal"/>
       <w:lvlText w:val=""/>
       <w:lvlJc w:val="left"/>
     </w:lvl>
-    <w:lvl w:ilvl="7" w:tplc="44C6D432">
+    <w:lvl w:ilvl="7" w:tplc="FD0C40E4">
       <w:numFmt w:val="decimal"/>
       <w:lvlText w:val=""/>
       <w:lvlJc w:val="left"/>
     </w:lvl>
-    <w:lvl w:ilvl="8" w:tplc="2834AD6E">
+    <w:lvl w:ilvl="8" w:tplc="EB466396">
       <w:numFmt w:val="decimal"/>
       <w:lvlText w:val=""/>
       <w:lvlJc w:val="left"/>
     </w:lvl>
   </w:abstractNum>
-  <w:num w:numId="1" w16cid:durableId="1169097485">
-    <w:abstractNumId w:val="0"/>
+  <w:abstractNum w:abstractNumId="1" w15:restartNumberingAfterBreak="0">
+    <w:nsid w:val="71441A88"/>
+    <w:multiLevelType w:val="hybridMultilevel"/>
+    <w:tmpl w:val="7506F1DC"/>
+    <w:lvl w:ilvl="0" w:tplc="4D0411B2">
+      <w:start w:val="1"/>
+      <w:numFmt w:val="bullet"/>
+      <w:lvlText w:val="●"/>
+      <w:lvlJc w:val="left"/>
+      <w:pPr>
+        <w:ind w:left="720" w:hanging="360"/>
+      </w:pPr>
+    </w:lvl>
+    <w:lvl w:ilvl="1" w:tplc="1CA8B9AE">
+      <w:start w:val="1"/>
+      <w:numFmt w:val="bullet"/>
+      <w:lvlText w:val="○"/>
+      <w:lvlJc w:val="left"/>
+      <w:pPr>
+        <w:ind w:left="1440" w:hanging="360"/>
+      </w:pPr>
+    </w:lvl>
+    <w:lvl w:ilvl="2" w:tplc="E8D2522C">
+      <w:start w:val="1"/>
+      <w:numFmt w:val="bullet"/>
+      <w:lvlText w:val="■"/>
+      <w:lvlJc w:val="left"/>
+      <w:pPr>
+        <w:ind w:left="2160" w:hanging="360"/>
+      </w:pPr>
+    </w:lvl>
+    <w:lvl w:ilvl="3" w:tplc="B8FE883A">
+      <w:start w:val="1"/>
+      <w:numFmt w:val="bullet"/>
+      <w:lvlText w:val="●"/>
+      <w:lvlJc w:val="left"/>
+      <w:pPr>
+        <w:ind w:left="2880" w:hanging="360"/>
+      </w:pPr>
+    </w:lvl>
+    <w:lvl w:ilvl="4" w:tplc="B5EA74BC">
+      <w:start w:val="1"/>
+      <w:numFmt w:val="bullet"/>
+      <w:lvlText w:val="○"/>
+      <w:lvlJc w:val="left"/>
+      <w:pPr>
+        <w:ind w:left="3600" w:hanging="360"/>
+      </w:pPr>
+    </w:lvl>
+    <w:lvl w:ilvl="5" w:tplc="EE54AEDC">
+      <w:start w:val="1"/>
+      <w:numFmt w:val="bullet"/>
+      <w:lvlText w:val="■"/>
+      <w:lvlJc w:val="left"/>
+      <w:pPr>
+        <w:ind w:left="4320" w:hanging="360"/>
+      </w:pPr>
+    </w:lvl>
+    <w:lvl w:ilvl="6" w:tplc="9E7EB806">
+      <w:start w:val="1"/>
+      <w:numFmt w:val="bullet"/>
+      <w:lvlText w:val="●"/>
+      <w:lvlJc w:val="left"/>
+      <w:pPr>
+        <w:ind w:left="5040" w:hanging="360"/>
+      </w:pPr>
+    </w:lvl>
+    <w:lvl w:ilvl="7" w:tplc="3D9AC02A">
+      <w:start w:val="1"/>
+      <w:numFmt w:val="bullet"/>
+      <w:lvlText w:val="●"/>
+      <w:lvlJc w:val="left"/>
+      <w:pPr>
+        <w:ind w:left="5760" w:hanging="360"/>
+      </w:pPr>
+    </w:lvl>
+    <w:lvl w:ilvl="8" w:tplc="9A808AFA">
+      <w:start w:val="1"/>
+      <w:numFmt w:val="bullet"/>
+      <w:lvlText w:val="●"/>
+      <w:lvlJc w:val="left"/>
+      <w:pPr>
+        <w:ind w:left="6480" w:hanging="360"/>
+      </w:pPr>
+    </w:lvl>
+  </w:abstractNum>
+  <w:num w:numId="1" w16cid:durableId="1558399418">
+    <w:abstractNumId w:val="1"/>
     <w:lvlOverride w:ilvl="0">
       <w:startOverride w:val="1"/>
     </w:lvlOverride>
   </w:num>
-  <w:num w:numId="2" w16cid:durableId="1340617100">
-    <w:abstractNumId w:val="1"/>
+  <w:num w:numId="2" w16cid:durableId="233053006">
+    <w:abstractNumId w:val="0"/>
     <w:lvlOverride w:ilvl="0">
       <w:startOverride w:val="1"/>
     </w:lvlOverride>

</xml_diff>